<commit_message>
Update research report in IMRAD format
</commit_message>
<xml_diff>
--- a/report/Research Report.docx
+++ b/report/Research Report.docx
@@ -4,343 +4,210 @@
   <w:body>
     <w:p>
       <w:r>
-        <w:t>Research Report</w:t>
-      </w:r>
-    </w:p>
-    <w:p>
-      <w:pPr>
-        <w:rPr>
-          <w:bCs/>
-          <w:lang w:val="af-ZA"/>
-        </w:rPr>
-      </w:pPr>
-      <w:r>
-        <w:rPr>
-          <w:b/>
-          <w:lang w:val="af-ZA"/>
-        </w:rPr>
-        <w:t>Introduction</w:t>
-      </w:r>
-      <w:r>
-        <w:rPr>
-          <w:bCs/>
-          <w:lang w:val="af-ZA"/>
-        </w:rPr>
-        <w:t>:</w:t>
-      </w:r>
-    </w:p>
-    <w:p>
-      <w:pPr>
-        <w:rPr>
-          <w:bCs/>
-          <w:lang w:val="af-ZA"/>
-        </w:rPr>
-      </w:pPr>
-      <w:r>
-        <w:rPr>
-          <w:bCs/>
-          <w:lang w:val="af-ZA"/>
-        </w:rPr>
-        <w:t>Background</w:t>
-      </w:r>
-    </w:p>
-    <w:p>
-      <w:pPr>
-        <w:rPr>
-          <w:bCs/>
-          <w:lang w:val="af-ZA"/>
-        </w:rPr>
-      </w:pPr>
-      <w:r>
-        <w:rPr>
-          <w:bCs/>
-          <w:lang w:val="af-ZA"/>
-        </w:rPr>
-        <w:t>One of the primary responsibilities of an operating system is mananging the allocation of CPU time am</w:t>
-      </w:r>
-      <w:r>
-        <w:rPr>
-          <w:bCs/>
-          <w:lang w:val="af-ZA"/>
-        </w:rPr>
-        <w:t>ong competing processs. Effiicient  CPU scheduling is critical to system performance, and numerous scheduling algorithms have been developed over the years to optimize different operational objectives, such as response time, throughout, waititng time, turnaround time, and CPU utilization.</w:t>
-      </w:r>
-    </w:p>
-    <w:p>
-      <w:pPr>
-        <w:rPr>
-          <w:bCs/>
-          <w:lang w:val="af-ZA"/>
-        </w:rPr>
-      </w:pPr>
-      <w:r>
-        <w:rPr>
-          <w:bCs/>
-          <w:lang w:val="af-ZA"/>
-        </w:rPr>
-        <w:t>Related work</w:t>
-      </w:r>
-    </w:p>
-    <w:p>
-      <w:pPr>
-        <w:rPr>
-          <w:bCs/>
-          <w:lang w:val="af-ZA"/>
-        </w:rPr>
-      </w:pPr>
-      <w:r>
-        <w:rPr>
-          <w:bCs/>
-          <w:lang w:val="af-ZA"/>
-        </w:rPr>
-        <w:t>Historically, CPU scheduling policies are categorized into non-preemtive approaches, where a process retains the CPU until completion, and preemptive approaches, where the operating system can interrupt a running process to allocate CPU time to a higher priotity task. Studies show that understanding these scheduling policies strictly through theoritical examples is often insufficeint for practical application. Modern multimedia environments. Such as audio and video systems, require dynamic simulation to evalutate how algorithms handle continuous process loads.</w:t>
-      </w:r>
-    </w:p>
-    <w:p>
-      <w:pPr>
-        <w:rPr>
-          <w:bCs/>
-          <w:lang w:val="af-ZA"/>
-        </w:rPr>
-      </w:pPr>
-      <w:r>
-        <w:rPr>
-          <w:bCs/>
-          <w:lang w:val="af-ZA"/>
-        </w:rPr>
-        <w:t>Problem statement</w:t>
-      </w:r>
-    </w:p>
-    <w:p>
-      <w:pPr>
-        <w:rPr>
-          <w:bCs/>
-          <w:lang w:val="af-ZA"/>
-        </w:rPr>
-      </w:pPr>
-      <w:r>
-        <w:rPr>
-          <w:bCs/>
-          <w:lang w:val="af-ZA"/>
-        </w:rPr>
-        <w:t>Aim and Objectives</w:t>
-      </w:r>
-    </w:p>
-    <w:p>
-      <w:pPr>
-        <w:rPr>
-          <w:bCs/>
-          <w:lang w:val="af-ZA"/>
-        </w:rPr>
-      </w:pPr>
-      <w:r>
-        <w:rPr>
-          <w:bCs/>
-          <w:lang w:val="af-ZA"/>
-        </w:rPr>
-        <w:t>Significance of the project</w:t>
-      </w:r>
-    </w:p>
-    <w:p>
-      <w:pPr>
-        <w:rPr>
-          <w:bCs/>
-          <w:lang w:val="af-ZA"/>
-        </w:rPr>
-      </w:pPr>
-    </w:p>
-    <w:p>
-      <w:pPr>
-        <w:rPr>
-          <w:b/>
-          <w:lang w:val="af-ZA"/>
-        </w:rPr>
-      </w:pPr>
-      <w:r>
-        <w:rPr>
-          <w:b/>
-          <w:lang w:val="af-ZA"/>
-        </w:rPr>
-        <w:t>Methodlogy</w:t>
-      </w:r>
-    </w:p>
-    <w:p>
-      <w:pPr>
-        <w:rPr>
-          <w:bCs/>
-          <w:lang w:val="af-ZA"/>
-        </w:rPr>
-      </w:pPr>
-    </w:p>
-    <w:p>
-      <w:pPr>
-        <w:rPr>
-          <w:bCs/>
-          <w:lang w:val="af-ZA"/>
-        </w:rPr>
-      </w:pPr>
-      <w:r>
-        <w:rPr>
-          <w:bCs/>
-          <w:lang w:val="af-ZA"/>
-        </w:rPr>
-        <w:t xml:space="preserve">Define tools used to implement the simulator and simulator flow diagram </w:t>
-      </w:r>
-    </w:p>
-    <w:p>
-      <w:pPr>
-        <w:rPr>
-          <w:bCs/>
-          <w:lang w:val="af-ZA"/>
-        </w:rPr>
-      </w:pPr>
-      <w:r>
-        <w:rPr>
-          <w:bCs/>
-          <w:lang w:val="af-ZA"/>
-        </w:rPr>
-        <w:t>Define algorithms to be compared</w:t>
-      </w:r>
-    </w:p>
-    <w:p>
-      <w:pPr>
-        <w:rPr>
-          <w:bCs/>
-          <w:lang w:val="af-ZA"/>
-        </w:rPr>
-      </w:pPr>
-      <w:r>
-        <w:rPr>
-          <w:bCs/>
-          <w:lang w:val="af-ZA"/>
-        </w:rPr>
-        <w:t>Performance metrics and formulae</w:t>
-      </w:r>
-    </w:p>
-    <w:p>
-      <w:pPr>
-        <w:rPr>
-          <w:bCs/>
-          <w:lang w:val="af-ZA"/>
-        </w:rPr>
-      </w:pPr>
-      <w:r>
-        <w:rPr>
-          <w:bCs/>
-          <w:lang w:val="af-ZA"/>
-        </w:rPr>
-        <w:t>Define Data collection methods (qualitative, quantitative, or Quantitative or Mixed Methods)</w:t>
-      </w:r>
-    </w:p>
-    <w:p>
-      <w:pPr>
-        <w:rPr>
-          <w:bCs/>
-          <w:lang w:val="af-ZA"/>
-        </w:rPr>
-      </w:pPr>
-      <w:r>
-        <w:rPr>
-          <w:bCs/>
-          <w:lang w:val="af-ZA"/>
-        </w:rPr>
-        <w:t>Data analysis tool that helps analyse results to determine which algorithm performs better than the other.</w:t>
-      </w:r>
-    </w:p>
-    <w:p>
-      <w:pPr>
-        <w:rPr>
-          <w:bCs/>
-          <w:lang w:val="af-ZA"/>
-        </w:rPr>
-      </w:pPr>
-    </w:p>
-    <w:p>
-      <w:pPr>
-        <w:rPr>
-          <w:b/>
-          <w:lang w:val="af-ZA"/>
-        </w:rPr>
-      </w:pPr>
-      <w:r>
-        <w:rPr>
-          <w:b/>
-          <w:lang w:val="af-ZA"/>
-        </w:rPr>
-        <w:t>Results and Analysis</w:t>
-      </w:r>
-    </w:p>
-    <w:p>
-      <w:pPr>
-        <w:rPr>
-          <w:bCs/>
-          <w:lang w:val="af-ZA"/>
-        </w:rPr>
-      </w:pPr>
-    </w:p>
-    <w:p>
-      <w:pPr>
-        <w:rPr>
-          <w:bCs/>
-          <w:lang w:val="af-ZA"/>
-        </w:rPr>
-      </w:pPr>
-      <w:r>
-        <w:rPr>
-          <w:bCs/>
-          <w:lang w:val="af-ZA"/>
-        </w:rPr>
-        <w:t>Graphical representation of results and analysis</w:t>
-      </w:r>
-    </w:p>
-    <w:p>
-      <w:pPr>
-        <w:rPr>
-          <w:bCs/>
-          <w:lang w:val="af-ZA"/>
-        </w:rPr>
-      </w:pPr>
-    </w:p>
-    <w:p>
-      <w:pPr>
-        <w:rPr>
-          <w:b/>
-          <w:lang w:val="af-ZA"/>
-        </w:rPr>
-      </w:pPr>
-      <w:r>
-        <w:rPr>
-          <w:b/>
-          <w:lang w:val="af-ZA"/>
-        </w:rPr>
-        <w:t>Discussion</w:t>
-      </w:r>
-    </w:p>
-    <w:p>
-      <w:pPr>
-        <w:rPr>
-          <w:bCs/>
-          <w:lang w:val="af-ZA"/>
-        </w:rPr>
-      </w:pPr>
-    </w:p>
-    <w:p>
-      <w:pPr>
-        <w:rPr>
-          <w:bCs/>
-          <w:lang w:val="af-ZA"/>
-        </w:rPr>
-      </w:pPr>
-      <w:r>
-        <w:rPr>
-          <w:bCs/>
-          <w:lang w:val="af-ZA"/>
-        </w:rPr>
+        <w:t>Title Page</w:t>
+      </w:r>
+    </w:p>
+    <w:p>
+      <w:r>
+        <w:t>Title: Performance Analysis of CPU Scheduling Algorithms (FCFS, SRTF, RR) for Audio-Video Systems</w:t>
+      </w:r>
+    </w:p>
+    <w:p>
+      <w:r>
+        <w:t>1. Introduction</w:t>
+      </w:r>
+    </w:p>
+    <w:p>
+      <w:r>
+        <w:t>1.1 Background: Briefly explain CPU scheduling. Mention that Audio-Video (A/V) systems are "soft real-time" systems that require strict timing to prevent buffer underruns (audio stuttering) or dropped frames (video lag).</w:t>
+      </w:r>
+    </w:p>
+    <w:p>
+      <w:r>
+        <w:t>1.2 Related Work: Cite 2-3 generic OS textbooks or papers (e.g., Silberschatz et al., "Operating System Concepts") that discuss how SRTF minimizes waiting time but RR provides fairness.</w:t>
+      </w:r>
+    </w:p>
+    <w:p>
+      <w:r>
+        <w:t>1.3 Problem Statement: Inefficient CPU scheduling in A/V systems leads to high response times, causing perceptible lag and poor user experience. There is a need to empirically determine which algorithm best handles increasing process loads.</w:t>
+      </w:r>
+    </w:p>
+    <w:p>
+      <w:r>
+        <w:t>1.4 Aim and Objectives:</w:t>
+      </w:r>
+    </w:p>
+    <w:p>
+      <w:r>
+        <w:t>Aim: To develop a simulator comparing FCFS, SRTF, and RR.</w:t>
+      </w:r>
+    </w:p>
+    <w:p>
+      <w:r>
+        <w:t>Objectives: (1) Generate workloads from 10 to 50 processes, (2) Measure WT, TAT, RT, Throughput, and CPU Utilization, (3) Identify the optimal algorithm for A/V systems.</w:t>
+      </w:r>
+    </w:p>
+    <w:p>
+      <w:r>
+        <w:t>1.5 Significance of the Project: Provides empirical data to help OS developers and A/V software engineers choose the most appropriate scheduling policy to guarantee smooth media playback.</w:t>
+      </w:r>
+    </w:p>
+    <w:p>
+      <w:r>
+        <w:t>2. Methodology</w:t>
+      </w:r>
+    </w:p>
+    <w:p>
+      <w:r>
+        <w:t>2.1 Tools Used: Python 3.x (for simulator logic), matplotlib (for data visualization), and csv (for data logging).</w:t>
+      </w:r>
+    </w:p>
+    <w:p>
+      <w:r>
+        <w:t>2.2 Simulator Flow Diagram: (Insert the Mermaid diagram provided below as an image).</w:t>
+      </w:r>
+    </w:p>
+    <w:p>
+      <w:r>
+        <w:t>2.3 Algorithms Defined: Brief 1-paragraph definitions of FCFS (Non-preemptive, queue-based), SRTF (Preemptive, shortest remaining time), and RR (Preemptive, fixed time quantum).</w:t>
+      </w:r>
+    </w:p>
+    <w:p>
+      <w:r>
+        <w:t>2.4 Performance Metrics and Formulae: List the 5 formulas clearly.</w:t>
+      </w:r>
+    </w:p>
+    <w:p>
+      <w:r>
+        <w:t>Turnaround Time = Completion Time - Arrival Time</w:t>
+      </w:r>
+    </w:p>
+    <w:p>
+      <w:r>
+        <w:t>Waiting Time = Turnaround Time - Burst Time</w:t>
+      </w:r>
+    </w:p>
+    <w:p>
+      <w:r>
+        <w:t>Response Time = First Execution Time - Arrival Time</w:t>
+      </w:r>
+    </w:p>
+    <w:p>
+      <w:r>
+        <w:t>CPU Utilization = (Total Busy Time / Total Elapsed Time) × 100</w:t>
+      </w:r>
+    </w:p>
+    <w:p>
+      <w:r>
+        <w:t>Throughput = Total Processes Completed / Total Elapsed Time</w:t>
+      </w:r>
+    </w:p>
+    <w:p>
+      <w:r>
+        <w:t>2.5 Data Collection Methods: This project utilizes a Quantitative Method. Numerical performance data is collected empirically through controlled, repeatable software simulation (using a fixed random seed for reproducibility).</w:t>
+      </w:r>
+    </w:p>
+    <w:p>
+      <w:r>
+        <w:t>2.6 Data Analysis Tool: Python matplotlib is used to perform comparative trend analysis, plotting metrics against increasing process counts to determine statistical superiority.</w:t>
+      </w:r>
+    </w:p>
+    <w:p>
+      <w:r>
+        <w:t>3. Results and Analysis</w:t>
+      </w:r>
+    </w:p>
+    <w:p>
+      <w:r>
         <w:lastRenderedPageBreak/>
-        <w:t xml:space="preserve">Discuss the findings in terms of the performance metrics and suggest the best-performing algorithm; further highlight the weaknesses and strengths of each algorithm and their area of application </w:t>
-      </w:r>
-    </w:p>
-    <w:p/>
+        <w:t>(Insert your 5 graphs here, neatly arranged. Ensure axes are labeled).</w:t>
+      </w:r>
+    </w:p>
+    <w:p>
+      <w:r>
+        <w:t>3.1 Waiting Time Analysis: "As shown in Figure 1, as processes increase to 50, SRTF maintains the lowest average waiting time..."</w:t>
+      </w:r>
+    </w:p>
+    <w:p>
+      <w:r>
+        <w:t>3.2 Turnaround Time Analysis: "Figure 2 demonstrates..."</w:t>
+      </w:r>
+    </w:p>
+    <w:p>
+      <w:r>
+        <w:t>3.3 Response Time Analysis: "Figure 3 highlights that Round Robin and SRTF significantly outperform FCFS in response time..."</w:t>
+      </w:r>
+    </w:p>
+    <w:p>
+      <w:r>
+        <w:t>3.4 Throughput &amp; CPU Utilization Analysis: "Figures 4 and 5 show..."</w:t>
+      </w:r>
+    </w:p>
+    <w:p>
+      <w:r>
+        <w:t>4. Discussion</w:t>
+      </w:r>
+    </w:p>
+    <w:p>
+      <w:r>
+        <w:t>4.1 Findings on Performance Metrics: Directly answer the 5 investigative questions from the prompt. (e.g., "SRTF minimizes waiting time and gives the best turnaround time. RR demonstrates highly competitive response time...").</w:t>
+      </w:r>
+    </w:p>
+    <w:p>
+      <w:r>
+        <w:t>4.2 Strengths and Weaknesses:</w:t>
+      </w:r>
+    </w:p>
+    <w:p>
+      <w:r>
+        <w:t>FCFS: Strength: Simple, low overhead. Weakness: Convoy effect, high response time.</w:t>
+      </w:r>
+    </w:p>
+    <w:p>
+      <w:r>
+        <w:t>SRTF: Strength: Optimal waiting/turnaround time. Weakness: Starvation of long processes, high context-switch overhead if not managed.</w:t>
+      </w:r>
+    </w:p>
+    <w:p>
+      <w:r>
+        <w:t>RR: Strength: Excellent fairness and predictable response time. Weakness: Throughput drops if time quantum is too small (excessive context switching).</w:t>
+      </w:r>
+    </w:p>
+    <w:p>
+      <w:r>
+        <w:t>4.3 Area of Application: Explicitly state: "For Audio-and-Video systems, Round Robin (with a tuned time quantum) or SRTF is the best-performing algorithm. A/V systems prioritize low Response Time to ensure immediate playback initiation and prevent buffer starvation, which RR and SRTF provide, unlike FCFS."</w:t>
+      </w:r>
+    </w:p>
+    <w:p>
+      <w:r>
+        <w:t>5. Conclusion</w:t>
+      </w:r>
+    </w:p>
+    <w:p>
+      <w:r>
+        <w:t>Summarize the aim, the method (simulating 10-50 processes), and the final verdict (e.g., SRTF/RR is best for A/V). State that the simulator successfully met all objectives.</w:t>
+      </w:r>
+    </w:p>
+    <w:p>
+      <w:r>
+        <w:t>6. References</w:t>
+      </w:r>
+    </w:p>
+    <w:p>
+      <w:r>
+        <w:t>List your textbooks/papers in APA or Harvard format.</w:t>
+      </w:r>
+    </w:p>
+    <w:p>
+      <w:r>
+        <w:t>Appendix</w:t>
+      </w:r>
+    </w:p>
+    <w:p>
+      <w:r>
+        <w:t>Mention: "Raw simulation data is provided in report/simulation_data.csv and source code is attached."</w:t>
+      </w:r>
+    </w:p>
     <w:sectPr>
       <w:pgSz w:w="11906" w:h="16838"/>
       <w:pgMar w:top="1440" w:right="1440" w:bottom="1440" w:left="1440" w:header="708" w:footer="708" w:gutter="0"/>
@@ -954,6 +821,7 @@
   <w:style w:type="character" w:default="1" w:styleId="DefaultParagraphFont">
     <w:name w:val="Default Paragraph Font"/>
     <w:uiPriority w:val="1"/>
+    <w:semiHidden/>
     <w:unhideWhenUsed/>
   </w:style>
   <w:style w:type="table" w:default="1" w:styleId="TableNormal">

</xml_diff>

<commit_message>
Add presentation slides and images used
</commit_message>
<xml_diff>
--- a/report/Research Report.docx
+++ b/report/Research Report.docx
@@ -7,25 +7,1843 @@
         <w:pStyle w:val="Title"/>
       </w:pPr>
       <w:r>
-        <w:t>Performance Analysis of CPU Scheduling Algorithms (FCFS, SRTF, RR) for Audio-Video Systems</w:t>
-      </w:r>
-    </w:p>
-    <w:p/>
+        <w:t xml:space="preserve">Performance Analysis of </w:t>
+      </w:r>
+    </w:p>
+    <w:p>
+      <w:pPr>
+        <w:pStyle w:val="Title"/>
+      </w:pPr>
+      <w:r>
+        <w:t xml:space="preserve">CPU Scheduling Algorithms </w:t>
+      </w:r>
+    </w:p>
+    <w:p>
+      <w:pPr>
+        <w:pStyle w:val="Title"/>
+      </w:pPr>
+      <w:r>
+        <w:t xml:space="preserve">(FCFS, SRTF, RR) </w:t>
+      </w:r>
+    </w:p>
+    <w:p>
+      <w:pPr>
+        <w:pStyle w:val="Title"/>
+      </w:pPr>
+      <w:r>
+        <w:t>for Audio-Video Systems</w:t>
+      </w:r>
+    </w:p>
+    <w:p>
+      <w:r>
+        <w:br w:type="page"/>
+      </w:r>
+    </w:p>
+    <w:sdt>
+      <w:sdtPr>
+        <w:id w:val="-1003734355"/>
+        <w:docPartObj>
+          <w:docPartGallery w:val="Table of Contents"/>
+          <w:docPartUnique/>
+        </w:docPartObj>
+      </w:sdtPr>
+      <w:sdtEndPr>
+        <w:rPr>
+          <w:rFonts w:asciiTheme="minorHAnsi" w:eastAsiaTheme="minorHAnsi" w:hAnsiTheme="minorHAnsi" w:cstheme="minorBidi"/>
+          <w:b/>
+          <w:bCs/>
+          <w:noProof/>
+          <w:color w:val="auto"/>
+          <w:kern w:val="2"/>
+          <w:sz w:val="22"/>
+          <w:szCs w:val="22"/>
+          <w:lang w:val="en-ZA"/>
+          <w14:ligatures w14:val="standardContextual"/>
+        </w:rPr>
+      </w:sdtEndPr>
+      <w:sdtContent>
+        <w:p>
+          <w:pPr>
+            <w:pStyle w:val="TOCHeading"/>
+          </w:pPr>
+          <w:r>
+            <w:t>Table of Contents</w:t>
+          </w:r>
+        </w:p>
+        <w:p>
+          <w:pPr>
+            <w:pStyle w:val="TOC2"/>
+            <w:tabs>
+              <w:tab w:val="right" w:leader="dot" w:pos="9016"/>
+            </w:tabs>
+            <w:rPr>
+              <w:rFonts w:eastAsiaTheme="minorEastAsia"/>
+              <w:noProof/>
+              <w:sz w:val="24"/>
+              <w:szCs w:val="24"/>
+              <w:lang w:eastAsia="en-ZA"/>
+            </w:rPr>
+          </w:pPr>
+          <w:r>
+            <w:fldChar w:fldCharType="begin"/>
+          </w:r>
+          <w:r>
+            <w:instrText xml:space="preserve"> TOC \o "1-3" \h \z \u </w:instrText>
+          </w:r>
+          <w:r>
+            <w:fldChar w:fldCharType="separate"/>
+          </w:r>
+          <w:hyperlink w:anchor="_Toc241819335" w:history="1">
+            <w:r>
+              <w:rPr>
+                <w:rStyle w:val="Hyperlink"/>
+                <w:noProof/>
+              </w:rPr>
+              <w:t>1. Introduction</w:t>
+            </w:r>
+            <w:r>
+              <w:rPr>
+                <w:noProof/>
+                <w:webHidden/>
+              </w:rPr>
+              <w:tab/>
+            </w:r>
+            <w:r>
+              <w:rPr>
+                <w:noProof/>
+                <w:webHidden/>
+              </w:rPr>
+              <w:fldChar w:fldCharType="begin"/>
+            </w:r>
+            <w:r>
+              <w:rPr>
+                <w:noProof/>
+                <w:webHidden/>
+              </w:rPr>
+              <w:instrText xml:space="preserve"> PAGEREF _Toc241819335 \h </w:instrText>
+            </w:r>
+            <w:r>
+              <w:rPr>
+                <w:noProof/>
+                <w:webHidden/>
+              </w:rPr>
+            </w:r>
+            <w:r>
+              <w:rPr>
+                <w:noProof/>
+                <w:webHidden/>
+              </w:rPr>
+              <w:fldChar w:fldCharType="separate"/>
+            </w:r>
+            <w:r>
+              <w:rPr>
+                <w:noProof/>
+                <w:webHidden/>
+              </w:rPr>
+              <w:t>3</w:t>
+            </w:r>
+            <w:r>
+              <w:rPr>
+                <w:noProof/>
+                <w:webHidden/>
+              </w:rPr>
+              <w:fldChar w:fldCharType="end"/>
+            </w:r>
+          </w:hyperlink>
+        </w:p>
+        <w:p>
+          <w:pPr>
+            <w:pStyle w:val="TOC3"/>
+            <w:tabs>
+              <w:tab w:val="right" w:leader="dot" w:pos="9016"/>
+            </w:tabs>
+            <w:rPr>
+              <w:rFonts w:eastAsiaTheme="minorEastAsia"/>
+              <w:noProof/>
+              <w:sz w:val="24"/>
+              <w:szCs w:val="24"/>
+              <w:lang w:eastAsia="en-ZA"/>
+            </w:rPr>
+          </w:pPr>
+          <w:hyperlink w:anchor="_Toc241819336" w:history="1">
+            <w:r>
+              <w:rPr>
+                <w:rStyle w:val="Hyperlink"/>
+                <w:noProof/>
+              </w:rPr>
+              <w:t>1.1 Background</w:t>
+            </w:r>
+            <w:r>
+              <w:rPr>
+                <w:noProof/>
+                <w:webHidden/>
+              </w:rPr>
+              <w:tab/>
+            </w:r>
+            <w:r>
+              <w:rPr>
+                <w:noProof/>
+                <w:webHidden/>
+              </w:rPr>
+              <w:fldChar w:fldCharType="begin"/>
+            </w:r>
+            <w:r>
+              <w:rPr>
+                <w:noProof/>
+                <w:webHidden/>
+              </w:rPr>
+              <w:instrText xml:space="preserve"> PAGEREF _Toc241819336 \h </w:instrText>
+            </w:r>
+            <w:r>
+              <w:rPr>
+                <w:noProof/>
+                <w:webHidden/>
+              </w:rPr>
+            </w:r>
+            <w:r>
+              <w:rPr>
+                <w:noProof/>
+                <w:webHidden/>
+              </w:rPr>
+              <w:fldChar w:fldCharType="separate"/>
+            </w:r>
+            <w:r>
+              <w:rPr>
+                <w:noProof/>
+                <w:webHidden/>
+              </w:rPr>
+              <w:t>3</w:t>
+            </w:r>
+            <w:r>
+              <w:rPr>
+                <w:noProof/>
+                <w:webHidden/>
+              </w:rPr>
+              <w:fldChar w:fldCharType="end"/>
+            </w:r>
+          </w:hyperlink>
+        </w:p>
+        <w:p>
+          <w:pPr>
+            <w:pStyle w:val="TOC3"/>
+            <w:tabs>
+              <w:tab w:val="right" w:leader="dot" w:pos="9016"/>
+            </w:tabs>
+            <w:rPr>
+              <w:rFonts w:eastAsiaTheme="minorEastAsia"/>
+              <w:noProof/>
+              <w:sz w:val="24"/>
+              <w:szCs w:val="24"/>
+              <w:lang w:eastAsia="en-ZA"/>
+            </w:rPr>
+          </w:pPr>
+          <w:hyperlink w:anchor="_Toc241819337" w:history="1">
+            <w:r>
+              <w:rPr>
+                <w:rStyle w:val="Hyperlink"/>
+                <w:noProof/>
+              </w:rPr>
+              <w:t>1.2 Related Work</w:t>
+            </w:r>
+            <w:r>
+              <w:rPr>
+                <w:noProof/>
+                <w:webHidden/>
+              </w:rPr>
+              <w:tab/>
+            </w:r>
+            <w:r>
+              <w:rPr>
+                <w:noProof/>
+                <w:webHidden/>
+              </w:rPr>
+              <w:fldChar w:fldCharType="begin"/>
+            </w:r>
+            <w:r>
+              <w:rPr>
+                <w:noProof/>
+                <w:webHidden/>
+              </w:rPr>
+              <w:instrText xml:space="preserve"> PAGEREF _Toc241819337 \h </w:instrText>
+            </w:r>
+            <w:r>
+              <w:rPr>
+                <w:noProof/>
+                <w:webHidden/>
+              </w:rPr>
+            </w:r>
+            <w:r>
+              <w:rPr>
+                <w:noProof/>
+                <w:webHidden/>
+              </w:rPr>
+              <w:fldChar w:fldCharType="separate"/>
+            </w:r>
+            <w:r>
+              <w:rPr>
+                <w:noProof/>
+                <w:webHidden/>
+              </w:rPr>
+              <w:t>3</w:t>
+            </w:r>
+            <w:r>
+              <w:rPr>
+                <w:noProof/>
+                <w:webHidden/>
+              </w:rPr>
+              <w:fldChar w:fldCharType="end"/>
+            </w:r>
+          </w:hyperlink>
+        </w:p>
+        <w:p>
+          <w:pPr>
+            <w:pStyle w:val="TOC3"/>
+            <w:tabs>
+              <w:tab w:val="right" w:leader="dot" w:pos="9016"/>
+            </w:tabs>
+            <w:rPr>
+              <w:rFonts w:eastAsiaTheme="minorEastAsia"/>
+              <w:noProof/>
+              <w:sz w:val="24"/>
+              <w:szCs w:val="24"/>
+              <w:lang w:eastAsia="en-ZA"/>
+            </w:rPr>
+          </w:pPr>
+          <w:hyperlink w:anchor="_Toc241819338" w:history="1">
+            <w:r>
+              <w:rPr>
+                <w:rStyle w:val="Hyperlink"/>
+                <w:noProof/>
+              </w:rPr>
+              <w:t>1.3 Problem Statement</w:t>
+            </w:r>
+            <w:r>
+              <w:rPr>
+                <w:noProof/>
+                <w:webHidden/>
+              </w:rPr>
+              <w:tab/>
+            </w:r>
+            <w:r>
+              <w:rPr>
+                <w:noProof/>
+                <w:webHidden/>
+              </w:rPr>
+              <w:fldChar w:fldCharType="begin"/>
+            </w:r>
+            <w:r>
+              <w:rPr>
+                <w:noProof/>
+                <w:webHidden/>
+              </w:rPr>
+              <w:instrText xml:space="preserve"> PAGEREF _Toc241819338 \h </w:instrText>
+            </w:r>
+            <w:r>
+              <w:rPr>
+                <w:noProof/>
+                <w:webHidden/>
+              </w:rPr>
+            </w:r>
+            <w:r>
+              <w:rPr>
+                <w:noProof/>
+                <w:webHidden/>
+              </w:rPr>
+              <w:fldChar w:fldCharType="separate"/>
+            </w:r>
+            <w:r>
+              <w:rPr>
+                <w:noProof/>
+                <w:webHidden/>
+              </w:rPr>
+              <w:t>3</w:t>
+            </w:r>
+            <w:r>
+              <w:rPr>
+                <w:noProof/>
+                <w:webHidden/>
+              </w:rPr>
+              <w:fldChar w:fldCharType="end"/>
+            </w:r>
+          </w:hyperlink>
+        </w:p>
+        <w:p>
+          <w:pPr>
+            <w:pStyle w:val="TOC3"/>
+            <w:tabs>
+              <w:tab w:val="right" w:leader="dot" w:pos="9016"/>
+            </w:tabs>
+            <w:rPr>
+              <w:rFonts w:eastAsiaTheme="minorEastAsia"/>
+              <w:noProof/>
+              <w:sz w:val="24"/>
+              <w:szCs w:val="24"/>
+              <w:lang w:eastAsia="en-ZA"/>
+            </w:rPr>
+          </w:pPr>
+          <w:hyperlink w:anchor="_Toc241819339" w:history="1">
+            <w:r>
+              <w:rPr>
+                <w:rStyle w:val="Hyperlink"/>
+                <w:noProof/>
+              </w:rPr>
+              <w:t>1.4 Aim and Objectives</w:t>
+            </w:r>
+            <w:r>
+              <w:rPr>
+                <w:noProof/>
+                <w:webHidden/>
+              </w:rPr>
+              <w:tab/>
+            </w:r>
+            <w:r>
+              <w:rPr>
+                <w:noProof/>
+                <w:webHidden/>
+              </w:rPr>
+              <w:fldChar w:fldCharType="begin"/>
+            </w:r>
+            <w:r>
+              <w:rPr>
+                <w:noProof/>
+                <w:webHidden/>
+              </w:rPr>
+              <w:instrText xml:space="preserve"> PAGEREF _Toc241819339 \h </w:instrText>
+            </w:r>
+            <w:r>
+              <w:rPr>
+                <w:noProof/>
+                <w:webHidden/>
+              </w:rPr>
+            </w:r>
+            <w:r>
+              <w:rPr>
+                <w:noProof/>
+                <w:webHidden/>
+              </w:rPr>
+              <w:fldChar w:fldCharType="separate"/>
+            </w:r>
+            <w:r>
+              <w:rPr>
+                <w:noProof/>
+                <w:webHidden/>
+              </w:rPr>
+              <w:t>3</w:t>
+            </w:r>
+            <w:r>
+              <w:rPr>
+                <w:noProof/>
+                <w:webHidden/>
+              </w:rPr>
+              <w:fldChar w:fldCharType="end"/>
+            </w:r>
+          </w:hyperlink>
+        </w:p>
+        <w:p>
+          <w:pPr>
+            <w:pStyle w:val="TOC3"/>
+            <w:tabs>
+              <w:tab w:val="right" w:leader="dot" w:pos="9016"/>
+            </w:tabs>
+            <w:rPr>
+              <w:rFonts w:eastAsiaTheme="minorEastAsia"/>
+              <w:noProof/>
+              <w:sz w:val="24"/>
+              <w:szCs w:val="24"/>
+              <w:lang w:eastAsia="en-ZA"/>
+            </w:rPr>
+          </w:pPr>
+          <w:hyperlink w:anchor="_Toc241819340" w:history="1">
+            <w:r>
+              <w:rPr>
+                <w:rStyle w:val="Hyperlink"/>
+                <w:noProof/>
+              </w:rPr>
+              <w:t>1.5 Significance of the Project</w:t>
+            </w:r>
+            <w:r>
+              <w:rPr>
+                <w:noProof/>
+                <w:webHidden/>
+              </w:rPr>
+              <w:tab/>
+            </w:r>
+            <w:r>
+              <w:rPr>
+                <w:noProof/>
+                <w:webHidden/>
+              </w:rPr>
+              <w:fldChar w:fldCharType="begin"/>
+            </w:r>
+            <w:r>
+              <w:rPr>
+                <w:noProof/>
+                <w:webHidden/>
+              </w:rPr>
+              <w:instrText xml:space="preserve"> PAGEREF _Toc241819340 \h </w:instrText>
+            </w:r>
+            <w:r>
+              <w:rPr>
+                <w:noProof/>
+                <w:webHidden/>
+              </w:rPr>
+            </w:r>
+            <w:r>
+              <w:rPr>
+                <w:noProof/>
+                <w:webHidden/>
+              </w:rPr>
+              <w:fldChar w:fldCharType="separate"/>
+            </w:r>
+            <w:r>
+              <w:rPr>
+                <w:noProof/>
+                <w:webHidden/>
+              </w:rPr>
+              <w:t>3</w:t>
+            </w:r>
+            <w:r>
+              <w:rPr>
+                <w:noProof/>
+                <w:webHidden/>
+              </w:rPr>
+              <w:fldChar w:fldCharType="end"/>
+            </w:r>
+          </w:hyperlink>
+        </w:p>
+        <w:p>
+          <w:pPr>
+            <w:pStyle w:val="TOC2"/>
+            <w:tabs>
+              <w:tab w:val="right" w:leader="dot" w:pos="9016"/>
+            </w:tabs>
+            <w:rPr>
+              <w:rFonts w:eastAsiaTheme="minorEastAsia"/>
+              <w:noProof/>
+              <w:sz w:val="24"/>
+              <w:szCs w:val="24"/>
+              <w:lang w:eastAsia="en-ZA"/>
+            </w:rPr>
+          </w:pPr>
+          <w:hyperlink w:anchor="_Toc241819341" w:history="1">
+            <w:r>
+              <w:rPr>
+                <w:rStyle w:val="Hyperlink"/>
+                <w:noProof/>
+              </w:rPr>
+              <w:t>2. Methodology</w:t>
+            </w:r>
+            <w:r>
+              <w:rPr>
+                <w:noProof/>
+                <w:webHidden/>
+              </w:rPr>
+              <w:tab/>
+            </w:r>
+            <w:r>
+              <w:rPr>
+                <w:noProof/>
+                <w:webHidden/>
+              </w:rPr>
+              <w:fldChar w:fldCharType="begin"/>
+            </w:r>
+            <w:r>
+              <w:rPr>
+                <w:noProof/>
+                <w:webHidden/>
+              </w:rPr>
+              <w:instrText xml:space="preserve"> PAGEREF _Toc241819341 \h </w:instrText>
+            </w:r>
+            <w:r>
+              <w:rPr>
+                <w:noProof/>
+                <w:webHidden/>
+              </w:rPr>
+            </w:r>
+            <w:r>
+              <w:rPr>
+                <w:noProof/>
+                <w:webHidden/>
+              </w:rPr>
+              <w:fldChar w:fldCharType="separate"/>
+            </w:r>
+            <w:r>
+              <w:rPr>
+                <w:noProof/>
+                <w:webHidden/>
+              </w:rPr>
+              <w:t>3</w:t>
+            </w:r>
+            <w:r>
+              <w:rPr>
+                <w:noProof/>
+                <w:webHidden/>
+              </w:rPr>
+              <w:fldChar w:fldCharType="end"/>
+            </w:r>
+          </w:hyperlink>
+        </w:p>
+        <w:p>
+          <w:pPr>
+            <w:pStyle w:val="TOC3"/>
+            <w:tabs>
+              <w:tab w:val="right" w:leader="dot" w:pos="9016"/>
+            </w:tabs>
+            <w:rPr>
+              <w:rFonts w:eastAsiaTheme="minorEastAsia"/>
+              <w:noProof/>
+              <w:sz w:val="24"/>
+              <w:szCs w:val="24"/>
+              <w:lang w:eastAsia="en-ZA"/>
+            </w:rPr>
+          </w:pPr>
+          <w:hyperlink w:anchor="_Toc241819342" w:history="1">
+            <w:r>
+              <w:rPr>
+                <w:rStyle w:val="Hyperlink"/>
+                <w:noProof/>
+              </w:rPr>
+              <w:t>2.1 Tools Used</w:t>
+            </w:r>
+            <w:r>
+              <w:rPr>
+                <w:noProof/>
+                <w:webHidden/>
+              </w:rPr>
+              <w:tab/>
+            </w:r>
+            <w:r>
+              <w:rPr>
+                <w:noProof/>
+                <w:webHidden/>
+              </w:rPr>
+              <w:fldChar w:fldCharType="begin"/>
+            </w:r>
+            <w:r>
+              <w:rPr>
+                <w:noProof/>
+                <w:webHidden/>
+              </w:rPr>
+              <w:instrText xml:space="preserve"> PAGEREF _Toc241819342 \h </w:instrText>
+            </w:r>
+            <w:r>
+              <w:rPr>
+                <w:noProof/>
+                <w:webHidden/>
+              </w:rPr>
+            </w:r>
+            <w:r>
+              <w:rPr>
+                <w:noProof/>
+                <w:webHidden/>
+              </w:rPr>
+              <w:fldChar w:fldCharType="separate"/>
+            </w:r>
+            <w:r>
+              <w:rPr>
+                <w:noProof/>
+                <w:webHidden/>
+              </w:rPr>
+              <w:t>3</w:t>
+            </w:r>
+            <w:r>
+              <w:rPr>
+                <w:noProof/>
+                <w:webHidden/>
+              </w:rPr>
+              <w:fldChar w:fldCharType="end"/>
+            </w:r>
+          </w:hyperlink>
+        </w:p>
+        <w:p>
+          <w:pPr>
+            <w:pStyle w:val="TOC3"/>
+            <w:tabs>
+              <w:tab w:val="right" w:leader="dot" w:pos="9016"/>
+            </w:tabs>
+            <w:rPr>
+              <w:rFonts w:eastAsiaTheme="minorEastAsia"/>
+              <w:noProof/>
+              <w:sz w:val="24"/>
+              <w:szCs w:val="24"/>
+              <w:lang w:eastAsia="en-ZA"/>
+            </w:rPr>
+          </w:pPr>
+          <w:hyperlink w:anchor="_Toc241819343" w:history="1">
+            <w:r>
+              <w:rPr>
+                <w:rStyle w:val="Hyperlink"/>
+                <w:noProof/>
+              </w:rPr>
+              <w:t>2.2 Simulator Flow Diagram</w:t>
+            </w:r>
+            <w:r>
+              <w:rPr>
+                <w:noProof/>
+                <w:webHidden/>
+              </w:rPr>
+              <w:tab/>
+            </w:r>
+            <w:r>
+              <w:rPr>
+                <w:noProof/>
+                <w:webHidden/>
+              </w:rPr>
+              <w:fldChar w:fldCharType="begin"/>
+            </w:r>
+            <w:r>
+              <w:rPr>
+                <w:noProof/>
+                <w:webHidden/>
+              </w:rPr>
+              <w:instrText xml:space="preserve"> PAGEREF _Toc241819343 \h </w:instrText>
+            </w:r>
+            <w:r>
+              <w:rPr>
+                <w:noProof/>
+                <w:webHidden/>
+              </w:rPr>
+            </w:r>
+            <w:r>
+              <w:rPr>
+                <w:noProof/>
+                <w:webHidden/>
+              </w:rPr>
+              <w:fldChar w:fldCharType="separate"/>
+            </w:r>
+            <w:r>
+              <w:rPr>
+                <w:noProof/>
+                <w:webHidden/>
+              </w:rPr>
+              <w:t>4</w:t>
+            </w:r>
+            <w:r>
+              <w:rPr>
+                <w:noProof/>
+                <w:webHidden/>
+              </w:rPr>
+              <w:fldChar w:fldCharType="end"/>
+            </w:r>
+          </w:hyperlink>
+        </w:p>
+        <w:p>
+          <w:pPr>
+            <w:pStyle w:val="TOC3"/>
+            <w:tabs>
+              <w:tab w:val="right" w:leader="dot" w:pos="9016"/>
+            </w:tabs>
+            <w:rPr>
+              <w:rFonts w:eastAsiaTheme="minorEastAsia"/>
+              <w:noProof/>
+              <w:sz w:val="24"/>
+              <w:szCs w:val="24"/>
+              <w:lang w:eastAsia="en-ZA"/>
+            </w:rPr>
+          </w:pPr>
+          <w:hyperlink w:anchor="_Toc241819344" w:history="1">
+            <w:r>
+              <w:rPr>
+                <w:rStyle w:val="Hyperlink"/>
+                <w:noProof/>
+              </w:rPr>
+              <w:t>2.3 Algorithms Defined</w:t>
+            </w:r>
+            <w:r>
+              <w:rPr>
+                <w:noProof/>
+                <w:webHidden/>
+              </w:rPr>
+              <w:tab/>
+            </w:r>
+            <w:r>
+              <w:rPr>
+                <w:noProof/>
+                <w:webHidden/>
+              </w:rPr>
+              <w:fldChar w:fldCharType="begin"/>
+            </w:r>
+            <w:r>
+              <w:rPr>
+                <w:noProof/>
+                <w:webHidden/>
+              </w:rPr>
+              <w:instrText xml:space="preserve"> PAGEREF _Toc241819344 \h </w:instrText>
+            </w:r>
+            <w:r>
+              <w:rPr>
+                <w:noProof/>
+                <w:webHidden/>
+              </w:rPr>
+            </w:r>
+            <w:r>
+              <w:rPr>
+                <w:noProof/>
+                <w:webHidden/>
+              </w:rPr>
+              <w:fldChar w:fldCharType="separate"/>
+            </w:r>
+            <w:r>
+              <w:rPr>
+                <w:noProof/>
+                <w:webHidden/>
+              </w:rPr>
+              <w:t>4</w:t>
+            </w:r>
+            <w:r>
+              <w:rPr>
+                <w:noProof/>
+                <w:webHidden/>
+              </w:rPr>
+              <w:fldChar w:fldCharType="end"/>
+            </w:r>
+          </w:hyperlink>
+        </w:p>
+        <w:p>
+          <w:pPr>
+            <w:pStyle w:val="TOC3"/>
+            <w:tabs>
+              <w:tab w:val="right" w:leader="dot" w:pos="9016"/>
+            </w:tabs>
+            <w:rPr>
+              <w:rFonts w:eastAsiaTheme="minorEastAsia"/>
+              <w:noProof/>
+              <w:sz w:val="24"/>
+              <w:szCs w:val="24"/>
+              <w:lang w:eastAsia="en-ZA"/>
+            </w:rPr>
+          </w:pPr>
+          <w:hyperlink w:anchor="_Toc241819345" w:history="1">
+            <w:r>
+              <w:rPr>
+                <w:rStyle w:val="Hyperlink"/>
+                <w:noProof/>
+              </w:rPr>
+              <w:t>2.4 Performance Metrics and Formulae</w:t>
+            </w:r>
+            <w:r>
+              <w:rPr>
+                <w:noProof/>
+                <w:webHidden/>
+              </w:rPr>
+              <w:tab/>
+            </w:r>
+            <w:r>
+              <w:rPr>
+                <w:noProof/>
+                <w:webHidden/>
+              </w:rPr>
+              <w:fldChar w:fldCharType="begin"/>
+            </w:r>
+            <w:r>
+              <w:rPr>
+                <w:noProof/>
+                <w:webHidden/>
+              </w:rPr>
+              <w:instrText xml:space="preserve"> PAGEREF _Toc241819345 \h </w:instrText>
+            </w:r>
+            <w:r>
+              <w:rPr>
+                <w:noProof/>
+                <w:webHidden/>
+              </w:rPr>
+            </w:r>
+            <w:r>
+              <w:rPr>
+                <w:noProof/>
+                <w:webHidden/>
+              </w:rPr>
+              <w:fldChar w:fldCharType="separate"/>
+            </w:r>
+            <w:r>
+              <w:rPr>
+                <w:noProof/>
+                <w:webHidden/>
+              </w:rPr>
+              <w:t>5</w:t>
+            </w:r>
+            <w:r>
+              <w:rPr>
+                <w:noProof/>
+                <w:webHidden/>
+              </w:rPr>
+              <w:fldChar w:fldCharType="end"/>
+            </w:r>
+          </w:hyperlink>
+        </w:p>
+        <w:p>
+          <w:pPr>
+            <w:pStyle w:val="TOC3"/>
+            <w:tabs>
+              <w:tab w:val="right" w:leader="dot" w:pos="9016"/>
+            </w:tabs>
+            <w:rPr>
+              <w:rFonts w:eastAsiaTheme="minorEastAsia"/>
+              <w:noProof/>
+              <w:sz w:val="24"/>
+              <w:szCs w:val="24"/>
+              <w:lang w:eastAsia="en-ZA"/>
+            </w:rPr>
+          </w:pPr>
+          <w:hyperlink w:anchor="_Toc241819346" w:history="1">
+            <w:r>
+              <w:rPr>
+                <w:rStyle w:val="Hyperlink"/>
+                <w:noProof/>
+              </w:rPr>
+              <w:t>2.5 Data Collection Methods</w:t>
+            </w:r>
+            <w:r>
+              <w:rPr>
+                <w:noProof/>
+                <w:webHidden/>
+              </w:rPr>
+              <w:tab/>
+            </w:r>
+            <w:r>
+              <w:rPr>
+                <w:noProof/>
+                <w:webHidden/>
+              </w:rPr>
+              <w:fldChar w:fldCharType="begin"/>
+            </w:r>
+            <w:r>
+              <w:rPr>
+                <w:noProof/>
+                <w:webHidden/>
+              </w:rPr>
+              <w:instrText xml:space="preserve"> PAGEREF _Toc241819346 \h </w:instrText>
+            </w:r>
+            <w:r>
+              <w:rPr>
+                <w:noProof/>
+                <w:webHidden/>
+              </w:rPr>
+            </w:r>
+            <w:r>
+              <w:rPr>
+                <w:noProof/>
+                <w:webHidden/>
+              </w:rPr>
+              <w:fldChar w:fldCharType="separate"/>
+            </w:r>
+            <w:r>
+              <w:rPr>
+                <w:noProof/>
+                <w:webHidden/>
+              </w:rPr>
+              <w:t>5</w:t>
+            </w:r>
+            <w:r>
+              <w:rPr>
+                <w:noProof/>
+                <w:webHidden/>
+              </w:rPr>
+              <w:fldChar w:fldCharType="end"/>
+            </w:r>
+          </w:hyperlink>
+        </w:p>
+        <w:p>
+          <w:pPr>
+            <w:pStyle w:val="TOC3"/>
+            <w:tabs>
+              <w:tab w:val="right" w:leader="dot" w:pos="9016"/>
+            </w:tabs>
+            <w:rPr>
+              <w:rFonts w:eastAsiaTheme="minorEastAsia"/>
+              <w:noProof/>
+              <w:sz w:val="24"/>
+              <w:szCs w:val="24"/>
+              <w:lang w:eastAsia="en-ZA"/>
+            </w:rPr>
+          </w:pPr>
+          <w:hyperlink w:anchor="_Toc241819347" w:history="1">
+            <w:r>
+              <w:rPr>
+                <w:rStyle w:val="Hyperlink"/>
+                <w:noProof/>
+              </w:rPr>
+              <w:t>2.6 Data Analysis Tool</w:t>
+            </w:r>
+            <w:r>
+              <w:rPr>
+                <w:noProof/>
+                <w:webHidden/>
+              </w:rPr>
+              <w:tab/>
+            </w:r>
+            <w:r>
+              <w:rPr>
+                <w:noProof/>
+                <w:webHidden/>
+              </w:rPr>
+              <w:fldChar w:fldCharType="begin"/>
+            </w:r>
+            <w:r>
+              <w:rPr>
+                <w:noProof/>
+                <w:webHidden/>
+              </w:rPr>
+              <w:instrText xml:space="preserve"> PAGEREF _Toc241819347 \h </w:instrText>
+            </w:r>
+            <w:r>
+              <w:rPr>
+                <w:noProof/>
+                <w:webHidden/>
+              </w:rPr>
+            </w:r>
+            <w:r>
+              <w:rPr>
+                <w:noProof/>
+                <w:webHidden/>
+              </w:rPr>
+              <w:fldChar w:fldCharType="separate"/>
+            </w:r>
+            <w:r>
+              <w:rPr>
+                <w:noProof/>
+                <w:webHidden/>
+              </w:rPr>
+              <w:t>5</w:t>
+            </w:r>
+            <w:r>
+              <w:rPr>
+                <w:noProof/>
+                <w:webHidden/>
+              </w:rPr>
+              <w:fldChar w:fldCharType="end"/>
+            </w:r>
+          </w:hyperlink>
+        </w:p>
+        <w:p>
+          <w:pPr>
+            <w:pStyle w:val="TOC2"/>
+            <w:tabs>
+              <w:tab w:val="right" w:leader="dot" w:pos="9016"/>
+            </w:tabs>
+            <w:rPr>
+              <w:rFonts w:eastAsiaTheme="minorEastAsia"/>
+              <w:noProof/>
+              <w:sz w:val="24"/>
+              <w:szCs w:val="24"/>
+              <w:lang w:eastAsia="en-ZA"/>
+            </w:rPr>
+          </w:pPr>
+          <w:hyperlink w:anchor="_Toc241819348" w:history="1">
+            <w:r>
+              <w:rPr>
+                <w:rStyle w:val="Hyperlink"/>
+                <w:noProof/>
+              </w:rPr>
+              <w:t>3. Results and Analysis</w:t>
+            </w:r>
+            <w:r>
+              <w:rPr>
+                <w:noProof/>
+                <w:webHidden/>
+              </w:rPr>
+              <w:tab/>
+            </w:r>
+            <w:r>
+              <w:rPr>
+                <w:noProof/>
+                <w:webHidden/>
+              </w:rPr>
+              <w:fldChar w:fldCharType="begin"/>
+            </w:r>
+            <w:r>
+              <w:rPr>
+                <w:noProof/>
+                <w:webHidden/>
+              </w:rPr>
+              <w:instrText xml:space="preserve"> PAGEREF _Toc241819348 \h </w:instrText>
+            </w:r>
+            <w:r>
+              <w:rPr>
+                <w:noProof/>
+                <w:webHidden/>
+              </w:rPr>
+            </w:r>
+            <w:r>
+              <w:rPr>
+                <w:noProof/>
+                <w:webHidden/>
+              </w:rPr>
+              <w:fldChar w:fldCharType="separate"/>
+            </w:r>
+            <w:r>
+              <w:rPr>
+                <w:noProof/>
+                <w:webHidden/>
+              </w:rPr>
+              <w:t>6</w:t>
+            </w:r>
+            <w:r>
+              <w:rPr>
+                <w:noProof/>
+                <w:webHidden/>
+              </w:rPr>
+              <w:fldChar w:fldCharType="end"/>
+            </w:r>
+          </w:hyperlink>
+        </w:p>
+        <w:p>
+          <w:pPr>
+            <w:pStyle w:val="TOC3"/>
+            <w:tabs>
+              <w:tab w:val="right" w:leader="dot" w:pos="9016"/>
+            </w:tabs>
+            <w:rPr>
+              <w:rFonts w:eastAsiaTheme="minorEastAsia"/>
+              <w:noProof/>
+              <w:sz w:val="24"/>
+              <w:szCs w:val="24"/>
+              <w:lang w:eastAsia="en-ZA"/>
+            </w:rPr>
+          </w:pPr>
+          <w:hyperlink w:anchor="_Toc241819349" w:history="1">
+            <w:r>
+              <w:rPr>
+                <w:rStyle w:val="Hyperlink"/>
+                <w:noProof/>
+              </w:rPr>
+              <w:t>3.1 Waiting Time Analysis</w:t>
+            </w:r>
+            <w:r>
+              <w:rPr>
+                <w:noProof/>
+                <w:webHidden/>
+              </w:rPr>
+              <w:tab/>
+            </w:r>
+            <w:r>
+              <w:rPr>
+                <w:noProof/>
+                <w:webHidden/>
+              </w:rPr>
+              <w:fldChar w:fldCharType="begin"/>
+            </w:r>
+            <w:r>
+              <w:rPr>
+                <w:noProof/>
+                <w:webHidden/>
+              </w:rPr>
+              <w:instrText xml:space="preserve"> PAGEREF _Toc241819349 \h </w:instrText>
+            </w:r>
+            <w:r>
+              <w:rPr>
+                <w:noProof/>
+                <w:webHidden/>
+              </w:rPr>
+            </w:r>
+            <w:r>
+              <w:rPr>
+                <w:noProof/>
+                <w:webHidden/>
+              </w:rPr>
+              <w:fldChar w:fldCharType="separate"/>
+            </w:r>
+            <w:r>
+              <w:rPr>
+                <w:noProof/>
+                <w:webHidden/>
+              </w:rPr>
+              <w:t>6</w:t>
+            </w:r>
+            <w:r>
+              <w:rPr>
+                <w:noProof/>
+                <w:webHidden/>
+              </w:rPr>
+              <w:fldChar w:fldCharType="end"/>
+            </w:r>
+          </w:hyperlink>
+        </w:p>
+        <w:p>
+          <w:pPr>
+            <w:pStyle w:val="TOC3"/>
+            <w:tabs>
+              <w:tab w:val="right" w:leader="dot" w:pos="9016"/>
+            </w:tabs>
+            <w:rPr>
+              <w:rFonts w:eastAsiaTheme="minorEastAsia"/>
+              <w:noProof/>
+              <w:sz w:val="24"/>
+              <w:szCs w:val="24"/>
+              <w:lang w:eastAsia="en-ZA"/>
+            </w:rPr>
+          </w:pPr>
+          <w:hyperlink w:anchor="_Toc241819350" w:history="1">
+            <w:r>
+              <w:rPr>
+                <w:rStyle w:val="Hyperlink"/>
+                <w:noProof/>
+              </w:rPr>
+              <w:t>3.2 Turnaround Time Analysis:</w:t>
+            </w:r>
+            <w:r>
+              <w:rPr>
+                <w:noProof/>
+                <w:webHidden/>
+              </w:rPr>
+              <w:tab/>
+            </w:r>
+            <w:r>
+              <w:rPr>
+                <w:noProof/>
+                <w:webHidden/>
+              </w:rPr>
+              <w:fldChar w:fldCharType="begin"/>
+            </w:r>
+            <w:r>
+              <w:rPr>
+                <w:noProof/>
+                <w:webHidden/>
+              </w:rPr>
+              <w:instrText xml:space="preserve"> PAGEREF _Toc241819350 \h </w:instrText>
+            </w:r>
+            <w:r>
+              <w:rPr>
+                <w:noProof/>
+                <w:webHidden/>
+              </w:rPr>
+            </w:r>
+            <w:r>
+              <w:rPr>
+                <w:noProof/>
+                <w:webHidden/>
+              </w:rPr>
+              <w:fldChar w:fldCharType="separate"/>
+            </w:r>
+            <w:r>
+              <w:rPr>
+                <w:noProof/>
+                <w:webHidden/>
+              </w:rPr>
+              <w:t>6</w:t>
+            </w:r>
+            <w:r>
+              <w:rPr>
+                <w:noProof/>
+                <w:webHidden/>
+              </w:rPr>
+              <w:fldChar w:fldCharType="end"/>
+            </w:r>
+          </w:hyperlink>
+        </w:p>
+        <w:p>
+          <w:pPr>
+            <w:pStyle w:val="TOC3"/>
+            <w:tabs>
+              <w:tab w:val="right" w:leader="dot" w:pos="9016"/>
+            </w:tabs>
+            <w:rPr>
+              <w:rFonts w:eastAsiaTheme="minorEastAsia"/>
+              <w:noProof/>
+              <w:sz w:val="24"/>
+              <w:szCs w:val="24"/>
+              <w:lang w:eastAsia="en-ZA"/>
+            </w:rPr>
+          </w:pPr>
+          <w:hyperlink w:anchor="_Toc241819351" w:history="1">
+            <w:r>
+              <w:rPr>
+                <w:rStyle w:val="Hyperlink"/>
+                <w:noProof/>
+              </w:rPr>
+              <w:t>3.3 Response Time Analysis</w:t>
+            </w:r>
+            <w:r>
+              <w:rPr>
+                <w:noProof/>
+                <w:webHidden/>
+              </w:rPr>
+              <w:tab/>
+            </w:r>
+            <w:r>
+              <w:rPr>
+                <w:noProof/>
+                <w:webHidden/>
+              </w:rPr>
+              <w:fldChar w:fldCharType="begin"/>
+            </w:r>
+            <w:r>
+              <w:rPr>
+                <w:noProof/>
+                <w:webHidden/>
+              </w:rPr>
+              <w:instrText xml:space="preserve"> PAGEREF _Toc241819351 \h </w:instrText>
+            </w:r>
+            <w:r>
+              <w:rPr>
+                <w:noProof/>
+                <w:webHidden/>
+              </w:rPr>
+            </w:r>
+            <w:r>
+              <w:rPr>
+                <w:noProof/>
+                <w:webHidden/>
+              </w:rPr>
+              <w:fldChar w:fldCharType="separate"/>
+            </w:r>
+            <w:r>
+              <w:rPr>
+                <w:noProof/>
+                <w:webHidden/>
+              </w:rPr>
+              <w:t>6</w:t>
+            </w:r>
+            <w:r>
+              <w:rPr>
+                <w:noProof/>
+                <w:webHidden/>
+              </w:rPr>
+              <w:fldChar w:fldCharType="end"/>
+            </w:r>
+          </w:hyperlink>
+        </w:p>
+        <w:p>
+          <w:pPr>
+            <w:pStyle w:val="TOC3"/>
+            <w:tabs>
+              <w:tab w:val="right" w:leader="dot" w:pos="9016"/>
+            </w:tabs>
+            <w:rPr>
+              <w:rFonts w:eastAsiaTheme="minorEastAsia"/>
+              <w:noProof/>
+              <w:sz w:val="24"/>
+              <w:szCs w:val="24"/>
+              <w:lang w:eastAsia="en-ZA"/>
+            </w:rPr>
+          </w:pPr>
+          <w:hyperlink w:anchor="_Toc241819352" w:history="1">
+            <w:r>
+              <w:rPr>
+                <w:rStyle w:val="Hyperlink"/>
+                <w:noProof/>
+              </w:rPr>
+              <w:t>3.4 Throughput &amp; CPU Utilization Analysis</w:t>
+            </w:r>
+            <w:r>
+              <w:rPr>
+                <w:noProof/>
+                <w:webHidden/>
+              </w:rPr>
+              <w:tab/>
+            </w:r>
+            <w:r>
+              <w:rPr>
+                <w:noProof/>
+                <w:webHidden/>
+              </w:rPr>
+              <w:fldChar w:fldCharType="begin"/>
+            </w:r>
+            <w:r>
+              <w:rPr>
+                <w:noProof/>
+                <w:webHidden/>
+              </w:rPr>
+              <w:instrText xml:space="preserve"> PAGEREF _Toc241819352 \h </w:instrText>
+            </w:r>
+            <w:r>
+              <w:rPr>
+                <w:noProof/>
+                <w:webHidden/>
+              </w:rPr>
+            </w:r>
+            <w:r>
+              <w:rPr>
+                <w:noProof/>
+                <w:webHidden/>
+              </w:rPr>
+              <w:fldChar w:fldCharType="separate"/>
+            </w:r>
+            <w:r>
+              <w:rPr>
+                <w:noProof/>
+                <w:webHidden/>
+              </w:rPr>
+              <w:t>6</w:t>
+            </w:r>
+            <w:r>
+              <w:rPr>
+                <w:noProof/>
+                <w:webHidden/>
+              </w:rPr>
+              <w:fldChar w:fldCharType="end"/>
+            </w:r>
+          </w:hyperlink>
+        </w:p>
+        <w:p>
+          <w:pPr>
+            <w:pStyle w:val="TOC2"/>
+            <w:tabs>
+              <w:tab w:val="right" w:leader="dot" w:pos="9016"/>
+            </w:tabs>
+            <w:rPr>
+              <w:rFonts w:eastAsiaTheme="minorEastAsia"/>
+              <w:noProof/>
+              <w:sz w:val="24"/>
+              <w:szCs w:val="24"/>
+              <w:lang w:eastAsia="en-ZA"/>
+            </w:rPr>
+          </w:pPr>
+          <w:hyperlink w:anchor="_Toc241819353" w:history="1">
+            <w:r>
+              <w:rPr>
+                <w:rStyle w:val="Hyperlink"/>
+                <w:noProof/>
+              </w:rPr>
+              <w:t>4. Discussion</w:t>
+            </w:r>
+            <w:r>
+              <w:rPr>
+                <w:noProof/>
+                <w:webHidden/>
+              </w:rPr>
+              <w:tab/>
+            </w:r>
+            <w:r>
+              <w:rPr>
+                <w:noProof/>
+                <w:webHidden/>
+              </w:rPr>
+              <w:fldChar w:fldCharType="begin"/>
+            </w:r>
+            <w:r>
+              <w:rPr>
+                <w:noProof/>
+                <w:webHidden/>
+              </w:rPr>
+              <w:instrText xml:space="preserve"> PAGEREF _Toc241819353 \h </w:instrText>
+            </w:r>
+            <w:r>
+              <w:rPr>
+                <w:noProof/>
+                <w:webHidden/>
+              </w:rPr>
+            </w:r>
+            <w:r>
+              <w:rPr>
+                <w:noProof/>
+                <w:webHidden/>
+              </w:rPr>
+              <w:fldChar w:fldCharType="separate"/>
+            </w:r>
+            <w:r>
+              <w:rPr>
+                <w:noProof/>
+                <w:webHidden/>
+              </w:rPr>
+              <w:t>7</w:t>
+            </w:r>
+            <w:r>
+              <w:rPr>
+                <w:noProof/>
+                <w:webHidden/>
+              </w:rPr>
+              <w:fldChar w:fldCharType="end"/>
+            </w:r>
+          </w:hyperlink>
+        </w:p>
+        <w:p>
+          <w:pPr>
+            <w:pStyle w:val="TOC3"/>
+            <w:tabs>
+              <w:tab w:val="right" w:leader="dot" w:pos="9016"/>
+            </w:tabs>
+            <w:rPr>
+              <w:rFonts w:eastAsiaTheme="minorEastAsia"/>
+              <w:noProof/>
+              <w:sz w:val="24"/>
+              <w:szCs w:val="24"/>
+              <w:lang w:eastAsia="en-ZA"/>
+            </w:rPr>
+          </w:pPr>
+          <w:hyperlink w:anchor="_Toc241819354" w:history="1">
+            <w:r>
+              <w:rPr>
+                <w:rStyle w:val="Hyperlink"/>
+                <w:noProof/>
+              </w:rPr>
+              <w:t>4.1 Findings on Performance Metrics</w:t>
+            </w:r>
+            <w:r>
+              <w:rPr>
+                <w:noProof/>
+                <w:webHidden/>
+              </w:rPr>
+              <w:tab/>
+            </w:r>
+            <w:r>
+              <w:rPr>
+                <w:noProof/>
+                <w:webHidden/>
+              </w:rPr>
+              <w:fldChar w:fldCharType="begin"/>
+            </w:r>
+            <w:r>
+              <w:rPr>
+                <w:noProof/>
+                <w:webHidden/>
+              </w:rPr>
+              <w:instrText xml:space="preserve"> PAGEREF _Toc241819354 \h </w:instrText>
+            </w:r>
+            <w:r>
+              <w:rPr>
+                <w:noProof/>
+                <w:webHidden/>
+              </w:rPr>
+            </w:r>
+            <w:r>
+              <w:rPr>
+                <w:noProof/>
+                <w:webHidden/>
+              </w:rPr>
+              <w:fldChar w:fldCharType="separate"/>
+            </w:r>
+            <w:r>
+              <w:rPr>
+                <w:noProof/>
+                <w:webHidden/>
+              </w:rPr>
+              <w:t>7</w:t>
+            </w:r>
+            <w:r>
+              <w:rPr>
+                <w:noProof/>
+                <w:webHidden/>
+              </w:rPr>
+              <w:fldChar w:fldCharType="end"/>
+            </w:r>
+          </w:hyperlink>
+        </w:p>
+        <w:p>
+          <w:pPr>
+            <w:pStyle w:val="TOC3"/>
+            <w:tabs>
+              <w:tab w:val="right" w:leader="dot" w:pos="9016"/>
+            </w:tabs>
+            <w:rPr>
+              <w:rFonts w:eastAsiaTheme="minorEastAsia"/>
+              <w:noProof/>
+              <w:sz w:val="24"/>
+              <w:szCs w:val="24"/>
+              <w:lang w:eastAsia="en-ZA"/>
+            </w:rPr>
+          </w:pPr>
+          <w:hyperlink w:anchor="_Toc241819355" w:history="1">
+            <w:r>
+              <w:rPr>
+                <w:rStyle w:val="Hyperlink"/>
+                <w:noProof/>
+              </w:rPr>
+              <w:t>4.2 Strengths and Weaknesses</w:t>
+            </w:r>
+            <w:r>
+              <w:rPr>
+                <w:noProof/>
+                <w:webHidden/>
+              </w:rPr>
+              <w:tab/>
+            </w:r>
+            <w:r>
+              <w:rPr>
+                <w:noProof/>
+                <w:webHidden/>
+              </w:rPr>
+              <w:fldChar w:fldCharType="begin"/>
+            </w:r>
+            <w:r>
+              <w:rPr>
+                <w:noProof/>
+                <w:webHidden/>
+              </w:rPr>
+              <w:instrText xml:space="preserve"> PAGEREF _Toc241819355 \h </w:instrText>
+            </w:r>
+            <w:r>
+              <w:rPr>
+                <w:noProof/>
+                <w:webHidden/>
+              </w:rPr>
+            </w:r>
+            <w:r>
+              <w:rPr>
+                <w:noProof/>
+                <w:webHidden/>
+              </w:rPr>
+              <w:fldChar w:fldCharType="separate"/>
+            </w:r>
+            <w:r>
+              <w:rPr>
+                <w:noProof/>
+                <w:webHidden/>
+              </w:rPr>
+              <w:t>7</w:t>
+            </w:r>
+            <w:r>
+              <w:rPr>
+                <w:noProof/>
+                <w:webHidden/>
+              </w:rPr>
+              <w:fldChar w:fldCharType="end"/>
+            </w:r>
+          </w:hyperlink>
+        </w:p>
+        <w:p>
+          <w:pPr>
+            <w:pStyle w:val="TOC3"/>
+            <w:tabs>
+              <w:tab w:val="right" w:leader="dot" w:pos="9016"/>
+            </w:tabs>
+            <w:rPr>
+              <w:rFonts w:eastAsiaTheme="minorEastAsia"/>
+              <w:noProof/>
+              <w:sz w:val="24"/>
+              <w:szCs w:val="24"/>
+              <w:lang w:eastAsia="en-ZA"/>
+            </w:rPr>
+          </w:pPr>
+          <w:hyperlink w:anchor="_Toc241819356" w:history="1">
+            <w:r>
+              <w:rPr>
+                <w:rStyle w:val="Hyperlink"/>
+                <w:noProof/>
+              </w:rPr>
+              <w:t>4.3 Area of Application</w:t>
+            </w:r>
+            <w:r>
+              <w:rPr>
+                <w:noProof/>
+                <w:webHidden/>
+              </w:rPr>
+              <w:tab/>
+            </w:r>
+            <w:r>
+              <w:rPr>
+                <w:noProof/>
+                <w:webHidden/>
+              </w:rPr>
+              <w:fldChar w:fldCharType="begin"/>
+            </w:r>
+            <w:r>
+              <w:rPr>
+                <w:noProof/>
+                <w:webHidden/>
+              </w:rPr>
+              <w:instrText xml:space="preserve"> PAGEREF _Toc241819356 \h </w:instrText>
+            </w:r>
+            <w:r>
+              <w:rPr>
+                <w:noProof/>
+                <w:webHidden/>
+              </w:rPr>
+            </w:r>
+            <w:r>
+              <w:rPr>
+                <w:noProof/>
+                <w:webHidden/>
+              </w:rPr>
+              <w:fldChar w:fldCharType="separate"/>
+            </w:r>
+            <w:r>
+              <w:rPr>
+                <w:noProof/>
+                <w:webHidden/>
+              </w:rPr>
+              <w:t>7</w:t>
+            </w:r>
+            <w:r>
+              <w:rPr>
+                <w:noProof/>
+                <w:webHidden/>
+              </w:rPr>
+              <w:fldChar w:fldCharType="end"/>
+            </w:r>
+          </w:hyperlink>
+        </w:p>
+        <w:p>
+          <w:pPr>
+            <w:pStyle w:val="TOC2"/>
+            <w:tabs>
+              <w:tab w:val="right" w:leader="dot" w:pos="9016"/>
+            </w:tabs>
+            <w:rPr>
+              <w:rFonts w:eastAsiaTheme="minorEastAsia"/>
+              <w:noProof/>
+              <w:sz w:val="24"/>
+              <w:szCs w:val="24"/>
+              <w:lang w:eastAsia="en-ZA"/>
+            </w:rPr>
+          </w:pPr>
+          <w:hyperlink w:anchor="_Toc241819357" w:history="1">
+            <w:r>
+              <w:rPr>
+                <w:rStyle w:val="Hyperlink"/>
+                <w:noProof/>
+              </w:rPr>
+              <w:t>5. Conclusion</w:t>
+            </w:r>
+            <w:r>
+              <w:rPr>
+                <w:noProof/>
+                <w:webHidden/>
+              </w:rPr>
+              <w:tab/>
+            </w:r>
+            <w:r>
+              <w:rPr>
+                <w:noProof/>
+                <w:webHidden/>
+              </w:rPr>
+              <w:fldChar w:fldCharType="begin"/>
+            </w:r>
+            <w:r>
+              <w:rPr>
+                <w:noProof/>
+                <w:webHidden/>
+              </w:rPr>
+              <w:instrText xml:space="preserve"> PAGEREF _Toc241819357 \h </w:instrText>
+            </w:r>
+            <w:r>
+              <w:rPr>
+                <w:noProof/>
+                <w:webHidden/>
+              </w:rPr>
+            </w:r>
+            <w:r>
+              <w:rPr>
+                <w:noProof/>
+                <w:webHidden/>
+              </w:rPr>
+              <w:fldChar w:fldCharType="separate"/>
+            </w:r>
+            <w:r>
+              <w:rPr>
+                <w:noProof/>
+                <w:webHidden/>
+              </w:rPr>
+              <w:t>7</w:t>
+            </w:r>
+            <w:r>
+              <w:rPr>
+                <w:noProof/>
+                <w:webHidden/>
+              </w:rPr>
+              <w:fldChar w:fldCharType="end"/>
+            </w:r>
+          </w:hyperlink>
+        </w:p>
+        <w:p>
+          <w:pPr>
+            <w:pStyle w:val="TOC2"/>
+            <w:tabs>
+              <w:tab w:val="right" w:leader="dot" w:pos="9016"/>
+            </w:tabs>
+            <w:rPr>
+              <w:rFonts w:eastAsiaTheme="minorEastAsia"/>
+              <w:noProof/>
+              <w:sz w:val="24"/>
+              <w:szCs w:val="24"/>
+              <w:lang w:eastAsia="en-ZA"/>
+            </w:rPr>
+          </w:pPr>
+          <w:hyperlink w:anchor="_Toc241819358" w:history="1">
+            <w:r>
+              <w:rPr>
+                <w:rStyle w:val="Hyperlink"/>
+                <w:noProof/>
+              </w:rPr>
+              <w:t>6. References</w:t>
+            </w:r>
+            <w:r>
+              <w:rPr>
+                <w:noProof/>
+                <w:webHidden/>
+              </w:rPr>
+              <w:tab/>
+            </w:r>
+            <w:r>
+              <w:rPr>
+                <w:noProof/>
+                <w:webHidden/>
+              </w:rPr>
+              <w:fldChar w:fldCharType="begin"/>
+            </w:r>
+            <w:r>
+              <w:rPr>
+                <w:noProof/>
+                <w:webHidden/>
+              </w:rPr>
+              <w:instrText xml:space="preserve"> PAGEREF _Toc241819358 \h </w:instrText>
+            </w:r>
+            <w:r>
+              <w:rPr>
+                <w:noProof/>
+                <w:webHidden/>
+              </w:rPr>
+            </w:r>
+            <w:r>
+              <w:rPr>
+                <w:noProof/>
+                <w:webHidden/>
+              </w:rPr>
+              <w:fldChar w:fldCharType="separate"/>
+            </w:r>
+            <w:r>
+              <w:rPr>
+                <w:noProof/>
+                <w:webHidden/>
+              </w:rPr>
+              <w:t>7</w:t>
+            </w:r>
+            <w:r>
+              <w:rPr>
+                <w:noProof/>
+                <w:webHidden/>
+              </w:rPr>
+              <w:fldChar w:fldCharType="end"/>
+            </w:r>
+          </w:hyperlink>
+        </w:p>
+        <w:p>
+          <w:r>
+            <w:rPr>
+              <w:b/>
+              <w:bCs/>
+              <w:noProof/>
+            </w:rPr>
+            <w:fldChar w:fldCharType="end"/>
+          </w:r>
+        </w:p>
+      </w:sdtContent>
+    </w:sdt>
+    <w:p>
+      <w:r>
+        <w:br w:type="page"/>
+      </w:r>
+    </w:p>
     <w:p>
       <w:pPr>
         <w:pStyle w:val="Heading2"/>
       </w:pPr>
-      <w:r>
+      <w:bookmarkStart w:id="0" w:name="_Toc241819335"/>
+      <w:r>
+        <w:lastRenderedPageBreak/>
         <w:t>1. Introduction</w:t>
       </w:r>
+      <w:bookmarkEnd w:id="0"/>
     </w:p>
     <w:p>
       <w:pPr>
         <w:pStyle w:val="Heading3"/>
       </w:pPr>
+      <w:bookmarkStart w:id="1" w:name="_Toc241819336"/>
       <w:r>
         <w:t>1.1 Background</w:t>
       </w:r>
+      <w:bookmarkEnd w:id="1"/>
     </w:p>
     <w:p>
       <w:r>
@@ -42,9 +1860,11 @@
       <w:pPr>
         <w:pStyle w:val="Heading3"/>
       </w:pPr>
+      <w:bookmarkStart w:id="2" w:name="_Toc241819337"/>
       <w:r>
         <w:t>1.2 Related Work</w:t>
       </w:r>
+      <w:bookmarkEnd w:id="2"/>
     </w:p>
     <w:p>
       <w:r>
@@ -125,9 +1945,11 @@
       <w:pPr>
         <w:pStyle w:val="Heading3"/>
       </w:pPr>
+      <w:bookmarkStart w:id="3" w:name="_Toc241819338"/>
       <w:r>
         <w:t>1.3 Problem Statement</w:t>
       </w:r>
+      <w:bookmarkEnd w:id="3"/>
     </w:p>
     <w:p>
       <w:r>
@@ -162,9 +1984,11 @@
       <w:pPr>
         <w:pStyle w:val="Heading3"/>
       </w:pPr>
+      <w:bookmarkStart w:id="4" w:name="_Toc241819339"/>
       <w:r>
         <w:t>1.4 Aim and Objectives</w:t>
       </w:r>
+      <w:bookmarkEnd w:id="4"/>
     </w:p>
     <w:p>
       <w:r>
@@ -242,9 +2066,11 @@
       <w:pPr>
         <w:pStyle w:val="Heading3"/>
       </w:pPr>
+      <w:bookmarkStart w:id="5" w:name="_Toc241819340"/>
       <w:r>
         <w:t>1.5 Significance of the Project</w:t>
       </w:r>
+      <w:bookmarkEnd w:id="5"/>
     </w:p>
     <w:p>
       <w:r>
@@ -269,65 +2095,71 @@
         <w:t xml:space="preserve"> software engineers choose the most appropriate scheduling policy.</w:t>
       </w:r>
       <w:r>
-        <w:t xml:space="preserve"> By understanding how algorithms </w:t>
-      </w:r>
+        <w:t xml:space="preserve"> By understanding how algorithms behave under load, developers can better configure system priorities to guarantee smooth, uninterrupted media </w:t>
+      </w:r>
+      <w:r>
+        <w:t>rendering</w:t>
+      </w:r>
+      <w:r>
+        <w:t xml:space="preserve"> and playback.</w:t>
+      </w:r>
+    </w:p>
+    <w:p>
+      <w:pPr>
+        <w:pStyle w:val="Heading2"/>
+      </w:pPr>
+      <w:bookmarkStart w:id="6" w:name="_Toc241819341"/>
+      <w:r>
+        <w:t>2. Methodology</w:t>
+      </w:r>
+      <w:bookmarkEnd w:id="6"/>
+    </w:p>
+    <w:p>
+      <w:pPr>
+        <w:pStyle w:val="Heading3"/>
+      </w:pPr>
+      <w:bookmarkStart w:id="7" w:name="_Toc241819342"/>
+      <w:r>
+        <w:t>2.1 Tools Used</w:t>
+      </w:r>
+      <w:bookmarkEnd w:id="7"/>
+      <w:r>
+        <w:t xml:space="preserve"> </w:t>
+      </w:r>
+    </w:p>
+    <w:p>
+      <w:r>
+        <w:t xml:space="preserve">The simulator was developed using </w:t>
+      </w:r>
+      <w:r>
+        <w:t>Python 3.13.15</w:t>
+      </w:r>
+      <w:r>
+        <w:t xml:space="preserve"> chosen for it’s robust data handling capabilities. The </w:t>
+      </w:r>
+      <w:r>
+        <w:rPr>
+          <w:color w:val="EE0000"/>
+        </w:rPr>
+        <w:t>dataclasses</w:t>
+      </w:r>
+      <w:r>
+        <w:t xml:space="preserve"> module was used for structured process modelling. Matplotlib was ut</w:t>
+      </w:r>
+      <w:r>
+        <w:t>ilized for data visualization and graphical trend analysis, while the built-in csv module was used for raw data logging.</w:t>
+      </w:r>
+    </w:p>
+    <w:p>
+      <w:pPr>
+        <w:pStyle w:val="Heading3"/>
+      </w:pPr>
+      <w:bookmarkStart w:id="8" w:name="_Toc241819343"/>
       <w:r>
         <w:lastRenderedPageBreak/>
-        <w:t xml:space="preserve">behave under load, developers can better configure system priorities to guarantee smooth, uninterrupted media </w:t>
-      </w:r>
-      <w:r>
-        <w:t>rendering</w:t>
-      </w:r>
-      <w:r>
-        <w:t xml:space="preserve"> and playback.</w:t>
-      </w:r>
-    </w:p>
-    <w:p>
-      <w:pPr>
-        <w:pStyle w:val="Heading2"/>
-      </w:pPr>
-      <w:r>
-        <w:t>2. Methodology</w:t>
-      </w:r>
-    </w:p>
-    <w:p>
-      <w:pPr>
-        <w:pStyle w:val="Heading3"/>
-      </w:pPr>
-      <w:r>
-        <w:t xml:space="preserve">2.1 Tools Used </w:t>
-      </w:r>
-    </w:p>
-    <w:p>
-      <w:r>
-        <w:t xml:space="preserve">The simulator was developed using </w:t>
-      </w:r>
-      <w:r>
-        <w:t>Python 3.13.15</w:t>
-      </w:r>
-      <w:r>
-        <w:t xml:space="preserve"> chosen for it’s robust data handling capabilities. The </w:t>
-      </w:r>
-      <w:r>
-        <w:rPr>
-          <w:color w:val="EE0000"/>
-        </w:rPr>
-        <w:t>dataclasses</w:t>
-      </w:r>
-      <w:r>
-        <w:t xml:space="preserve"> module was used for structured process modelling. Matplotlib was ut</w:t>
-      </w:r>
-      <w:r>
-        <w:t>ilized for data visualization and graphical trend analysis, while the built-in csv module was used for raw data logging.</w:t>
-      </w:r>
-    </w:p>
-    <w:p>
-      <w:pPr>
-        <w:pStyle w:val="Heading3"/>
-      </w:pPr>
-      <w:r>
         <w:t>2.2 Simulator Flow Diagram</w:t>
       </w:r>
+      <w:bookmarkEnd w:id="8"/>
     </w:p>
     <w:p>
       <w:r>
@@ -384,10 +2216,11 @@
       <w:pPr>
         <w:pStyle w:val="Heading3"/>
       </w:pPr>
-      <w:r>
-        <w:lastRenderedPageBreak/>
+      <w:bookmarkStart w:id="9" w:name="_Toc241819344"/>
+      <w:r>
         <w:t>2.3 Algorithms Defined</w:t>
       </w:r>
+      <w:bookmarkEnd w:id="9"/>
     </w:p>
     <w:p>
       <w:pPr>
@@ -405,13 +2238,7 @@
         <w:t>First-Come, First-Served (FCFS):</w:t>
       </w:r>
       <w:r>
-        <w:t xml:space="preserve"> A non-</w:t>
-      </w:r>
-      <w:r>
-        <w:t>pre-emptive</w:t>
-      </w:r>
-      <w:r>
-        <w:t xml:space="preserve"> algorithm where processes are executed strictly in the order of their arrival time.</w:t>
+        <w:t xml:space="preserve"> A non-pre-emptive algorithm where processes are executed strictly in the order of their arrival time.</w:t>
       </w:r>
     </w:p>
     <w:p>
@@ -430,19 +2257,7 @@
         <w:t>Shortest Remaining Time First (SRTF):</w:t>
       </w:r>
       <w:r>
-        <w:t xml:space="preserve"> A </w:t>
-      </w:r>
-      <w:r>
-        <w:t>pre-emptive</w:t>
-      </w:r>
-      <w:r>
-        <w:t xml:space="preserve"> version of Shortest Job First. The CPU is allocated to the process with the smallest remaining execution time. If a new process arrives with a shorter remaining time than the currently executing process, </w:t>
-      </w:r>
-      <w:r>
-        <w:t>pre-emption</w:t>
-      </w:r>
-      <w:r>
-        <w:t xml:space="preserve"> occurs.</w:t>
+        <w:t xml:space="preserve"> A pre-emptive version of Shortest Job First. The CPU is allocated to the process with the smallest remaining execution time. If a new process arrives with a shorter remaining time than the currently executing process, pre-emption occurs.</w:t>
       </w:r>
     </w:p>
     <w:p>
@@ -461,19 +2276,7 @@
         <w:t>Round Robin (RR):</w:t>
       </w:r>
       <w:r>
-        <w:t xml:space="preserve"> A </w:t>
-      </w:r>
-      <w:r>
-        <w:t>pre-emptive</w:t>
-      </w:r>
-      <w:r>
-        <w:t xml:space="preserve"> time-slicing algorithm. Each process is assigned a random time quantum. If a process does not complete within its quantum, it is </w:t>
-      </w:r>
-      <w:r>
-        <w:t>pre-empted</w:t>
-      </w:r>
-      <w:r>
-        <w:t xml:space="preserve"> and placed at the back of the ready queue.</w:t>
+        <w:t xml:space="preserve"> A pre-emptive time-slicing algorithm. Each process is assigned a random time quantum. If a process does not complete within its quantum, it is pre-empted and placed at the back of the ready queue.</w:t>
       </w:r>
     </w:p>
     <w:p>
@@ -489,6 +2292,7 @@
           <w:bCs/>
           <w:color w:val="EE0000"/>
         </w:rPr>
+        <w:lastRenderedPageBreak/>
         <w:t>Clarification on Algorithm Selection</w:t>
       </w:r>
       <w:r>
@@ -556,9 +2360,11 @@
       <w:pPr>
         <w:pStyle w:val="Heading3"/>
       </w:pPr>
+      <w:bookmarkStart w:id="10" w:name="_Toc241819345"/>
       <w:r>
         <w:t>2.4 Performance Metrics and Formulae</w:t>
       </w:r>
+      <w:bookmarkEnd w:id="10"/>
     </w:p>
     <w:p>
       <w:r>
@@ -629,9 +2435,11 @@
       <w:pPr>
         <w:pStyle w:val="Heading3"/>
       </w:pPr>
+      <w:bookmarkStart w:id="11" w:name="_Toc241819346"/>
       <w:r>
         <w:t>2.5 Data Collection Methods</w:t>
       </w:r>
+      <w:bookmarkEnd w:id="11"/>
     </w:p>
     <w:p>
       <w:r>
@@ -642,9 +2450,11 @@
       <w:pPr>
         <w:pStyle w:val="Heading3"/>
       </w:pPr>
+      <w:bookmarkStart w:id="12" w:name="_Toc241819347"/>
       <w:r>
         <w:t>2.6 Data Analysis Tool</w:t>
       </w:r>
+      <w:bookmarkEnd w:id="12"/>
     </w:p>
     <w:p>
       <w:r>
@@ -655,10 +2465,12 @@
       <w:pPr>
         <w:pStyle w:val="Heading2"/>
       </w:pPr>
+      <w:bookmarkStart w:id="13" w:name="_Toc241819348"/>
       <w:r>
         <w:lastRenderedPageBreak/>
         <w:t>3. Results and Analysis</w:t>
       </w:r>
+      <w:bookmarkEnd w:id="13"/>
     </w:p>
     <w:p>
       <w:r>
@@ -709,53 +2521,235 @@
       </w:r>
     </w:p>
     <w:p>
-      <w:r>
-        <w:t>3.1 Waiting Time Analysis: "As shown in Figure 1, as processes increase to 50, SRTF maintains the lowest average waiting time..."</w:t>
-      </w:r>
-    </w:p>
-    <w:p>
-      <w:r>
-        <w:t>3.2 Turnaround Time Analysis: "Figure 2 demonstrates..."</w:t>
-      </w:r>
-    </w:p>
-    <w:p>
-      <w:r>
-        <w:t>3.3 Response Time Analysis: "Figure 3 highlights that Round Robin and SRTF significantly outperform FCFS in response time..."</w:t>
-      </w:r>
-    </w:p>
-    <w:p>
-      <w:r>
-        <w:t>3.4 Throughput &amp; CPU Utilization Analysis: "Figures 4 and 5 show..."</w:t>
+      <w:bookmarkStart w:id="14" w:name="_Toc241819349"/>
+      <w:r>
+        <w:rPr>
+          <w:rStyle w:val="Heading3Char"/>
+        </w:rPr>
+        <w:t>3.1 Waiting Time Analysis</w:t>
+      </w:r>
+      <w:bookmarkEnd w:id="14"/>
+      <w:r>
+        <w:t xml:space="preserve">: </w:t>
+      </w:r>
+      <w:r>
+        <w:t>Figure 1 illustrates the average waiting time as the number of processes scales from 10 to 50. The data indicates that SRTF consistently maintains the lowest average waiting time. Conversely, FCFS exhibits a steep upward trend, yielding the highest waiting times. RR maintains a moderate waiting time, performing significantly better than FCFC but slightly worse than SRTF.</w:t>
+      </w:r>
+    </w:p>
+    <w:p>
+      <w:bookmarkStart w:id="15" w:name="_Toc241819350"/>
+      <w:r>
+        <w:rPr>
+          <w:rStyle w:val="Heading3Char"/>
+        </w:rPr>
+        <w:t>3.2 Turnaround Time Analysis:</w:t>
+      </w:r>
+      <w:bookmarkEnd w:id="15"/>
+      <w:r>
+        <w:t xml:space="preserve"> Figure 2 demonstrates</w:t>
+      </w:r>
+      <w:r>
+        <w:t xml:space="preserve"> </w:t>
+      </w:r>
+      <w:r>
+        <w:rPr>
+          <w:lang w:val="en-US"/>
+        </w:rPr>
+        <w:t xml:space="preserve">They turn around time trends shows mirror their waiting time results. SRTF provides the optimal </w:t>
+      </w:r>
+      <w:r>
+        <w:rPr>
+          <w:lang w:val="en-US"/>
+        </w:rPr>
+        <w:t>(</w:t>
+      </w:r>
+      <w:r>
+        <w:rPr>
+          <w:lang w:val="en-US"/>
+        </w:rPr>
+        <w:t>lowest</w:t>
+      </w:r>
+      <w:r>
+        <w:rPr>
+          <w:lang w:val="en-US"/>
+        </w:rPr>
+        <w:t>)</w:t>
+      </w:r>
+      <w:r>
+        <w:rPr>
+          <w:lang w:val="en-US"/>
+        </w:rPr>
+        <w:t xml:space="preserve"> average turnaround time across all process counts. FCFS demonstrates the current performance, as long processes at the front of the queue delay the completion of the subsequent shorter processes.</w:t>
+      </w:r>
+    </w:p>
+    <w:p>
+      <w:bookmarkStart w:id="16" w:name="_Toc241819351"/>
+      <w:r>
+        <w:rPr>
+          <w:rStyle w:val="Heading3Char"/>
+        </w:rPr>
+        <w:t>3.3 Response Time Analysis</w:t>
+      </w:r>
+      <w:bookmarkEnd w:id="16"/>
+      <w:r>
+        <w:t xml:space="preserve">: Figure 3 highlights </w:t>
+      </w:r>
+      <w:r>
+        <w:rPr>
+          <w:lang w:val="en-US"/>
+        </w:rPr>
+        <w:t>A critical divergent in algorithm behavior. FCFS shows a severe degradation in response time S processes increase, leaning processes wait a long time before receiving their first CPU cycle.</w:t>
+      </w:r>
+      <w:r>
+        <w:rPr>
+          <w:b/>
+          <w:bCs/>
+          <w:lang w:val="en-US"/>
+        </w:rPr>
+        <w:t xml:space="preserve"> </w:t>
+      </w:r>
+      <w:r>
+        <w:rPr>
+          <w:lang w:val="en-US"/>
+        </w:rPr>
+        <w:t>Demonstrate highly competitive and low response times, with RR providing a highly predictable and stable response time curve regardless of the process load.</w:t>
+      </w:r>
+    </w:p>
+    <w:p>
+      <w:bookmarkStart w:id="17" w:name="_Toc241819352"/>
+      <w:r>
+        <w:rPr>
+          <w:rStyle w:val="Heading3Char"/>
+        </w:rPr>
+        <w:t>3.4 Throughput &amp; CPU Utilization Analysis</w:t>
+      </w:r>
+      <w:bookmarkEnd w:id="17"/>
+      <w:r>
+        <w:t>: Figures 4 and 5 show</w:t>
+      </w:r>
+      <w:r>
+        <w:t xml:space="preserve"> </w:t>
+      </w:r>
+      <w:r>
+        <w:rPr>
+          <w:lang w:val="en-US"/>
+        </w:rPr>
+        <w:t xml:space="preserve">That CPU utilization remains consistently high </w:t>
+      </w:r>
+      <w:r>
+        <w:rPr>
+          <w:lang w:val="en-US"/>
+        </w:rPr>
+        <w:t>(</w:t>
+      </w:r>
+      <w:r>
+        <w:rPr>
+          <w:lang w:val="en-US"/>
+        </w:rPr>
+        <w:t>approaching 100%</w:t>
+      </w:r>
+      <w:r>
+        <w:rPr>
+          <w:lang w:val="en-US"/>
+        </w:rPr>
+        <w:t>)</w:t>
+      </w:r>
+      <w:r>
+        <w:rPr>
+          <w:lang w:val="en-US"/>
+        </w:rPr>
+        <w:t xml:space="preserve"> across all three algorithms, as the randomized </w:t>
+      </w:r>
+      <w:r>
+        <w:rPr>
+          <w:lang w:val="en-US"/>
+        </w:rPr>
+        <w:lastRenderedPageBreak/>
+        <w:t>arrival times ensure the CPU is r</w:t>
+      </w:r>
+      <w:r>
+        <w:rPr>
+          <w:lang w:val="en-US"/>
+        </w:rPr>
+        <w:t>arely idle</w:t>
+      </w:r>
+      <w:r>
+        <w:rPr>
+          <w:lang w:val="en-US"/>
+        </w:rPr>
+        <w:t xml:space="preserve">. However, SRTF demonstrates the highest </w:t>
+      </w:r>
+      <w:r>
+        <w:rPr>
+          <w:lang w:val="en-US"/>
+        </w:rPr>
+        <w:t xml:space="preserve">throughput. </w:t>
+      </w:r>
+      <w:r>
+        <w:rPr>
+          <w:lang w:val="en-US"/>
+        </w:rPr>
+        <w:t xml:space="preserve">Because SRTF rapidly clears short processes, it </w:t>
+      </w:r>
+      <w:r>
+        <w:rPr>
+          <w:lang w:val="en-US"/>
+        </w:rPr>
+        <w:t>completes</w:t>
+      </w:r>
+      <w:r>
+        <w:rPr>
+          <w:lang w:val="en-US"/>
+        </w:rPr>
+        <w:t xml:space="preserve"> a higher volume of tasks within the total elapsed time compared to FCS and </w:t>
+      </w:r>
+      <w:r>
+        <w:rPr>
+          <w:lang w:val="en-US"/>
+        </w:rPr>
+        <w:t>RR.</w:t>
       </w:r>
     </w:p>
     <w:p>
       <w:pPr>
         <w:pStyle w:val="Heading2"/>
       </w:pPr>
+      <w:bookmarkStart w:id="18" w:name="_Toc241819353"/>
       <w:r>
         <w:t>4. Discussion</w:t>
       </w:r>
+      <w:bookmarkEnd w:id="18"/>
     </w:p>
     <w:p>
       <w:pPr>
         <w:pStyle w:val="Heading3"/>
       </w:pPr>
+      <w:bookmarkStart w:id="19" w:name="_Toc241819354"/>
       <w:r>
         <w:t>4.1 Findings on Performance Metrics</w:t>
       </w:r>
-    </w:p>
-    <w:p>
-      <w:r>
-        <w:t xml:space="preserve"> Directly answer the 5 investigative questions from the prompt. (e.g., "SRTF minimizes waiting time and gives the best turnaround time. RR demonstrates highly competitive response time...").</w:t>
+      <w:bookmarkEnd w:id="19"/>
+    </w:p>
+    <w:p>
+      <w:r>
+        <w:t xml:space="preserve"> </w:t>
+      </w:r>
+      <w:r>
+        <w:rPr>
+          <w:color w:val="EE0000"/>
+        </w:rPr>
+        <w:t>Directly answer the 5 investigative questions from the prompt. (e.g., "SRTF minimizes waiting time and gives the best turnaround time. RR demonstrates highly competitive response time...").</w:t>
       </w:r>
     </w:p>
     <w:p>
       <w:pPr>
         <w:pStyle w:val="Heading3"/>
       </w:pPr>
+      <w:bookmarkStart w:id="20" w:name="_Toc241819355"/>
       <w:r>
         <w:t>4.2 Strengths and Weaknesses</w:t>
       </w:r>
+      <w:bookmarkEnd w:id="20"/>
     </w:p>
     <w:p>
       <w:r>
@@ -764,7 +2758,6 @@
     </w:p>
     <w:p>
       <w:r>
-        <w:lastRenderedPageBreak/>
         <w:t>SRTF: Strength: Optimal waiting/turnaround time. Weakness: Starvation of long processes, high context-switch overhead if not managed.</w:t>
       </w:r>
     </w:p>
@@ -777,44 +2770,197 @@
       <w:pPr>
         <w:pStyle w:val="Heading3"/>
       </w:pPr>
+      <w:bookmarkStart w:id="21" w:name="_Toc241819356"/>
       <w:r>
         <w:t>4.3 Area of Application</w:t>
       </w:r>
-    </w:p>
-    <w:p>
-      <w:r>
-        <w:t xml:space="preserve"> Explicitly state: "For Audio-and-Video systems, Round Robin (with a tuned time quantum) or SRTF is the best-performing algorithm. A/V systems prioritize low Response Time to ensure immediate playback initiation and prevent buffer starvation, which RR and SRTF provide, unlike FCFS."</w:t>
+      <w:bookmarkEnd w:id="21"/>
+    </w:p>
+    <w:p>
+      <w:r>
+        <w:t xml:space="preserve"> For Audio-and-Video systems, Round Robin (with a tuned time quantum) or SRTF is the best-performing algorithm. A/V systems prioritize low Response Time to ensure immediate playback initiation and prevent buffer starvation, which RR and SRTF provide, unlike FCFS.</w:t>
+      </w:r>
+      <w:r>
+        <w:t xml:space="preserve"> </w:t>
+      </w:r>
+      <w:r>
+        <w:rPr>
+          <w:lang w:val="en-US"/>
+        </w:rPr>
+        <w:t>If an audio decoding thread or a video rendering thread is served of CPU time as can happen in SRT</w:t>
+      </w:r>
+      <w:r>
+        <w:rPr>
+          <w:lang w:val="en-US"/>
+        </w:rPr>
+        <w:t>F</w:t>
+      </w:r>
+      <w:r>
+        <w:rPr>
+          <w:lang w:val="en-US"/>
+        </w:rPr>
+        <w:t xml:space="preserve"> </w:t>
+      </w:r>
+      <w:r>
+        <w:rPr>
+          <w:lang w:val="en-US"/>
+        </w:rPr>
+        <w:t>(</w:t>
+      </w:r>
+      <w:r>
+        <w:rPr>
+          <w:lang w:val="en-US"/>
+        </w:rPr>
+        <w:t>if many short processes arrive</w:t>
+      </w:r>
+      <w:r>
+        <w:rPr>
+          <w:lang w:val="en-US"/>
+        </w:rPr>
+        <w:t>)</w:t>
+      </w:r>
+      <w:r>
+        <w:rPr>
+          <w:lang w:val="en-US"/>
+        </w:rPr>
+        <w:t>, it results in dropped frames of audio chattering. Round Robin guarantees that every thread gets a regular slice of CPU time, ensuring smooth, continuous media playback without starvation, making it the most robust choice for soft real time audio or video environment</w:t>
+      </w:r>
+      <w:r>
+        <w:rPr>
+          <w:lang w:val="en-US"/>
+        </w:rPr>
+        <w:t>s</w:t>
+      </w:r>
+      <w:r>
+        <w:rPr>
+          <w:lang w:val="en-US"/>
+        </w:rPr>
+        <w:t>.</w:t>
       </w:r>
     </w:p>
     <w:p>
       <w:pPr>
         <w:pStyle w:val="Heading2"/>
       </w:pPr>
+      <w:bookmarkStart w:id="22" w:name="_Toc241819357"/>
       <w:r>
         <w:t>5. Conclusion</w:t>
       </w:r>
-    </w:p>
-    <w:p>
-      <w:r>
-        <w:t>Summarize the aim, the method (simulating 10-50 processes), and the final verdict (e.g., SRTF/RR is best for A/V). State that the simulator successfully met all objectives.</w:t>
-      </w:r>
-    </w:p>
+      <w:bookmarkEnd w:id="22"/>
+    </w:p>
+    <w:p>
+      <w:r>
+        <w:rPr>
+          <w:lang w:val="en-US"/>
+        </w:rPr>
+        <w:t xml:space="preserve">This project successfully developed a discrete event simulator to evaluate the performance of FCFS, SRTF, and round Robin CPU scheduling algorithms under scaling workloads </w:t>
+      </w:r>
+      <w:r>
+        <w:rPr>
+          <w:lang w:val="en-US"/>
+        </w:rPr>
+        <w:t>(</w:t>
+      </w:r>
+      <w:r>
+        <w:rPr>
+          <w:lang w:val="en-US"/>
+        </w:rPr>
+        <w:t>10 to 50 processors</w:t>
+      </w:r>
+      <w:r>
+        <w:rPr>
+          <w:lang w:val="en-US"/>
+        </w:rPr>
+        <w:t>)</w:t>
+      </w:r>
+      <w:r>
+        <w:rPr>
+          <w:lang w:val="en-US"/>
+        </w:rPr>
+        <w:t xml:space="preserve">. The quantitative analysis revealed that while SRTF is mathematically superior in minimizing waiting time, </w:t>
+      </w:r>
+      <w:r>
+        <w:rPr>
+          <w:lang w:val="en-US"/>
+        </w:rPr>
+        <w:t>turnaround</w:t>
+      </w:r>
+      <w:r>
+        <w:rPr>
+          <w:lang w:val="en-US"/>
+        </w:rPr>
+        <w:t xml:space="preserve"> time and maximizing throughput, round Robin provides the most stable and predictable response times. </w:t>
+      </w:r>
+      <w:r>
+        <w:rPr>
+          <w:lang w:val="en-US"/>
+        </w:rPr>
+        <w:t>For a</w:t>
+      </w:r>
+      <w:r>
+        <w:rPr>
+          <w:lang w:val="en-US"/>
+        </w:rPr>
+        <w:t xml:space="preserve">udio and video systems, we're preventing buffer starvation and maintaining low response times are critical to user experience, round Robin images as the most suitable and reliable scheduling accolading. The simulator </w:t>
+      </w:r>
+      <w:r>
+        <w:rPr>
+          <w:lang w:val="en-US"/>
+        </w:rPr>
+        <w:t>m</w:t>
+      </w:r>
+      <w:r>
+        <w:rPr>
+          <w:lang w:val="en-US"/>
+        </w:rPr>
+        <w:t>et all project objective</w:t>
+      </w:r>
+      <w:r>
+        <w:rPr>
+          <w:lang w:val="en-US"/>
+        </w:rPr>
+        <w:t xml:space="preserve">s, </w:t>
+      </w:r>
+      <w:r>
+        <w:rPr>
+          <w:lang w:val="en-US"/>
+        </w:rPr>
+        <w:t xml:space="preserve">providing each </w:t>
+      </w:r>
+      <w:r>
+        <w:rPr>
+          <w:lang w:val="en-US"/>
+        </w:rPr>
+        <w:t xml:space="preserve">clear, </w:t>
+      </w:r>
+      <w:r>
+        <w:rPr>
+          <w:lang w:val="en-US"/>
+        </w:rPr>
+        <w:t>empirical basis for algorithm selection in multimedia computing</w:t>
+      </w:r>
+      <w:r>
+        <w:rPr>
+          <w:lang w:val="en-US"/>
+        </w:rPr>
+        <w:t>.</w:t>
+      </w:r>
+    </w:p>
+    <w:bookmarkStart w:id="23" w:name="_Toc241819358" w:displacedByCustomXml="next"/>
     <w:sdt>
       <w:sdtPr>
+        <w:rPr>
+          <w:rFonts w:asciiTheme="minorHAnsi" w:eastAsiaTheme="minorHAnsi" w:hAnsiTheme="minorHAnsi" w:cstheme="minorBidi"/>
+          <w:color w:val="auto"/>
+          <w:sz w:val="22"/>
+          <w:szCs w:val="22"/>
+        </w:rPr>
         <w:id w:val="1255471498"/>
         <w:docPartObj>
           <w:docPartGallery w:val="Bibliographies"/>
           <w:docPartUnique/>
         </w:docPartObj>
       </w:sdtPr>
-      <w:sdtEndPr>
-        <w:rPr>
-          <w:rFonts w:asciiTheme="minorHAnsi" w:eastAsiaTheme="minorHAnsi" w:hAnsiTheme="minorHAnsi" w:cstheme="minorBidi"/>
-          <w:color w:val="auto"/>
-          <w:sz w:val="22"/>
-          <w:szCs w:val="22"/>
-        </w:rPr>
-      </w:sdtEndPr>
       <w:sdtContent>
         <w:p>
           <w:pPr>
@@ -823,6 +2969,7 @@
           <w:r>
             <w:t>6. References</w:t>
           </w:r>
+          <w:bookmarkEnd w:id="23"/>
         </w:p>
         <w:sdt>
           <w:sdtPr>
@@ -2369,6 +4516,63 @@
     <w:unhideWhenUsed/>
     <w:rsid w:val="004F634D"/>
   </w:style>
+  <w:style w:type="paragraph" w:styleId="TOCHeading">
+    <w:name w:val="TOC Heading"/>
+    <w:basedOn w:val="Heading1"/>
+    <w:next w:val="Normal"/>
+    <w:uiPriority w:val="39"/>
+    <w:unhideWhenUsed/>
+    <w:qFormat/>
+    <w:rsid w:val="00B079EC"/>
+    <w:pPr>
+      <w:spacing w:before="240" w:after="0"/>
+      <w:outlineLvl w:val="9"/>
+    </w:pPr>
+    <w:rPr>
+      <w:kern w:val="0"/>
+      <w:sz w:val="32"/>
+      <w:szCs w:val="32"/>
+      <w:lang w:val="en-US"/>
+      <w14:ligatures w14:val="none"/>
+    </w:rPr>
+  </w:style>
+  <w:style w:type="paragraph" w:styleId="TOC2">
+    <w:name w:val="toc 2"/>
+    <w:basedOn w:val="Normal"/>
+    <w:next w:val="Normal"/>
+    <w:autoRedefine/>
+    <w:uiPriority w:val="39"/>
+    <w:unhideWhenUsed/>
+    <w:rsid w:val="00B079EC"/>
+    <w:pPr>
+      <w:spacing w:after="100"/>
+      <w:ind w:left="220"/>
+    </w:pPr>
+  </w:style>
+  <w:style w:type="paragraph" w:styleId="TOC3">
+    <w:name w:val="toc 3"/>
+    <w:basedOn w:val="Normal"/>
+    <w:next w:val="Normal"/>
+    <w:autoRedefine/>
+    <w:uiPriority w:val="39"/>
+    <w:unhideWhenUsed/>
+    <w:rsid w:val="00B079EC"/>
+    <w:pPr>
+      <w:spacing w:after="100"/>
+      <w:ind w:left="440"/>
+    </w:pPr>
+  </w:style>
+  <w:style w:type="character" w:styleId="Hyperlink">
+    <w:name w:val="Hyperlink"/>
+    <w:basedOn w:val="DefaultParagraphFont"/>
+    <w:uiPriority w:val="99"/>
+    <w:unhideWhenUsed/>
+    <w:rsid w:val="00B079EC"/>
+    <w:rPr>
+      <w:color w:val="467886" w:themeColor="hyperlink"/>
+      <w:u w:val="single"/>
+    </w:rPr>
+  </w:style>
 </w:styles>
 </file>
 

</xml_diff>

<commit_message>
Add final IMRAD report
</commit_message>
<xml_diff>
--- a/report/Research Report.docx
+++ b/report/Research Report.docx
@@ -41,6 +41,15 @@
     </w:p>
     <w:sdt>
       <w:sdtPr>
+        <w:rPr>
+          <w:rFonts w:asciiTheme="minorHAnsi" w:eastAsiaTheme="minorHAnsi" w:hAnsiTheme="minorHAnsi" w:cstheme="minorBidi"/>
+          <w:color w:val="auto"/>
+          <w:kern w:val="2"/>
+          <w:sz w:val="22"/>
+          <w:szCs w:val="22"/>
+          <w:lang w:val="en-ZA"/>
+          <w14:ligatures w14:val="standardContextual"/>
+        </w:rPr>
         <w:id w:val="-1003734355"/>
         <w:docPartObj>
           <w:docPartGallery w:val="Table of Contents"/>
@@ -49,16 +58,9 @@
       </w:sdtPr>
       <w:sdtEndPr>
         <w:rPr>
-          <w:rFonts w:asciiTheme="minorHAnsi" w:eastAsiaTheme="minorHAnsi" w:hAnsiTheme="minorHAnsi" w:cstheme="minorBidi"/>
           <w:b/>
           <w:bCs/>
           <w:noProof/>
-          <w:color w:val="auto"/>
-          <w:kern w:val="2"/>
-          <w:sz w:val="22"/>
-          <w:szCs w:val="22"/>
-          <w:lang w:val="en-ZA"/>
-          <w14:ligatures w14:val="standardContextual"/>
         </w:rPr>
       </w:sdtEndPr>
       <w:sdtContent>
@@ -93,7 +95,7 @@
           <w:r>
             <w:fldChar w:fldCharType="separate"/>
           </w:r>
-          <w:hyperlink w:anchor="_Toc241819335" w:history="1">
+          <w:hyperlink w:anchor="_Toc242125099" w:history="1">
             <w:r>
               <w:rPr>
                 <w:rStyle w:val="Hyperlink"/>
@@ -120,7 +122,7 @@
                 <w:noProof/>
                 <w:webHidden/>
               </w:rPr>
-              <w:instrText xml:space="preserve"> PAGEREF _Toc241819335 \h </w:instrText>
+              <w:instrText xml:space="preserve"> PAGEREF _Toc242125099 \h </w:instrText>
             </w:r>
             <w:r>
               <w:rPr>
@@ -165,7 +167,7 @@
               <w:lang w:eastAsia="en-ZA"/>
             </w:rPr>
           </w:pPr>
-          <w:hyperlink w:anchor="_Toc241819336" w:history="1">
+          <w:hyperlink w:anchor="_Toc242125100" w:history="1">
             <w:r>
               <w:rPr>
                 <w:rStyle w:val="Hyperlink"/>
@@ -192,7 +194,7 @@
                 <w:noProof/>
                 <w:webHidden/>
               </w:rPr>
-              <w:instrText xml:space="preserve"> PAGEREF _Toc241819336 \h </w:instrText>
+              <w:instrText xml:space="preserve"> PAGEREF _Toc242125100 \h </w:instrText>
             </w:r>
             <w:r>
               <w:rPr>
@@ -237,7 +239,7 @@
               <w:lang w:eastAsia="en-ZA"/>
             </w:rPr>
           </w:pPr>
-          <w:hyperlink w:anchor="_Toc241819337" w:history="1">
+          <w:hyperlink w:anchor="_Toc242125101" w:history="1">
             <w:r>
               <w:rPr>
                 <w:rStyle w:val="Hyperlink"/>
@@ -264,7 +266,7 @@
                 <w:noProof/>
                 <w:webHidden/>
               </w:rPr>
-              <w:instrText xml:space="preserve"> PAGEREF _Toc241819337 \h </w:instrText>
+              <w:instrText xml:space="preserve"> PAGEREF _Toc242125101 \h </w:instrText>
             </w:r>
             <w:r>
               <w:rPr>
@@ -309,7 +311,7 @@
               <w:lang w:eastAsia="en-ZA"/>
             </w:rPr>
           </w:pPr>
-          <w:hyperlink w:anchor="_Toc241819338" w:history="1">
+          <w:hyperlink w:anchor="_Toc242125102" w:history="1">
             <w:r>
               <w:rPr>
                 <w:rStyle w:val="Hyperlink"/>
@@ -336,7 +338,7 @@
                 <w:noProof/>
                 <w:webHidden/>
               </w:rPr>
-              <w:instrText xml:space="preserve"> PAGEREF _Toc241819338 \h </w:instrText>
+              <w:instrText xml:space="preserve"> PAGEREF _Toc242125102 \h </w:instrText>
             </w:r>
             <w:r>
               <w:rPr>
@@ -381,7 +383,7 @@
               <w:lang w:eastAsia="en-ZA"/>
             </w:rPr>
           </w:pPr>
-          <w:hyperlink w:anchor="_Toc241819339" w:history="1">
+          <w:hyperlink w:anchor="_Toc242125103" w:history="1">
             <w:r>
               <w:rPr>
                 <w:rStyle w:val="Hyperlink"/>
@@ -408,7 +410,7 @@
                 <w:noProof/>
                 <w:webHidden/>
               </w:rPr>
-              <w:instrText xml:space="preserve"> PAGEREF _Toc241819339 \h </w:instrText>
+              <w:instrText xml:space="preserve"> PAGEREF _Toc242125103 \h </w:instrText>
             </w:r>
             <w:r>
               <w:rPr>
@@ -453,7 +455,7 @@
               <w:lang w:eastAsia="en-ZA"/>
             </w:rPr>
           </w:pPr>
-          <w:hyperlink w:anchor="_Toc241819340" w:history="1">
+          <w:hyperlink w:anchor="_Toc242125104" w:history="1">
             <w:r>
               <w:rPr>
                 <w:rStyle w:val="Hyperlink"/>
@@ -480,7 +482,7 @@
                 <w:noProof/>
                 <w:webHidden/>
               </w:rPr>
-              <w:instrText xml:space="preserve"> PAGEREF _Toc241819340 \h </w:instrText>
+              <w:instrText xml:space="preserve"> PAGEREF _Toc242125104 \h </w:instrText>
             </w:r>
             <w:r>
               <w:rPr>
@@ -525,7 +527,7 @@
               <w:lang w:eastAsia="en-ZA"/>
             </w:rPr>
           </w:pPr>
-          <w:hyperlink w:anchor="_Toc241819341" w:history="1">
+          <w:hyperlink w:anchor="_Toc242125105" w:history="1">
             <w:r>
               <w:rPr>
                 <w:rStyle w:val="Hyperlink"/>
@@ -552,7 +554,7 @@
                 <w:noProof/>
                 <w:webHidden/>
               </w:rPr>
-              <w:instrText xml:space="preserve"> PAGEREF _Toc241819341 \h </w:instrText>
+              <w:instrText xml:space="preserve"> PAGEREF _Toc242125105 \h </w:instrText>
             </w:r>
             <w:r>
               <w:rPr>
@@ -597,7 +599,7 @@
               <w:lang w:eastAsia="en-ZA"/>
             </w:rPr>
           </w:pPr>
-          <w:hyperlink w:anchor="_Toc241819342" w:history="1">
+          <w:hyperlink w:anchor="_Toc242125106" w:history="1">
             <w:r>
               <w:rPr>
                 <w:rStyle w:val="Hyperlink"/>
@@ -624,7 +626,7 @@
                 <w:noProof/>
                 <w:webHidden/>
               </w:rPr>
-              <w:instrText xml:space="preserve"> PAGEREF _Toc241819342 \h </w:instrText>
+              <w:instrText xml:space="preserve"> PAGEREF _Toc242125106 \h </w:instrText>
             </w:r>
             <w:r>
               <w:rPr>
@@ -669,7 +671,7 @@
               <w:lang w:eastAsia="en-ZA"/>
             </w:rPr>
           </w:pPr>
-          <w:hyperlink w:anchor="_Toc241819343" w:history="1">
+          <w:hyperlink w:anchor="_Toc242125107" w:history="1">
             <w:r>
               <w:rPr>
                 <w:rStyle w:val="Hyperlink"/>
@@ -696,7 +698,7 @@
                 <w:noProof/>
                 <w:webHidden/>
               </w:rPr>
-              <w:instrText xml:space="preserve"> PAGEREF _Toc241819343 \h </w:instrText>
+              <w:instrText xml:space="preserve"> PAGEREF _Toc242125107 \h </w:instrText>
             </w:r>
             <w:r>
               <w:rPr>
@@ -741,7 +743,7 @@
               <w:lang w:eastAsia="en-ZA"/>
             </w:rPr>
           </w:pPr>
-          <w:hyperlink w:anchor="_Toc241819344" w:history="1">
+          <w:hyperlink w:anchor="_Toc242125108" w:history="1">
             <w:r>
               <w:rPr>
                 <w:rStyle w:val="Hyperlink"/>
@@ -768,7 +770,7 @@
                 <w:noProof/>
                 <w:webHidden/>
               </w:rPr>
-              <w:instrText xml:space="preserve"> PAGEREF _Toc241819344 \h </w:instrText>
+              <w:instrText xml:space="preserve"> PAGEREF _Toc242125108 \h </w:instrText>
             </w:r>
             <w:r>
               <w:rPr>
@@ -813,7 +815,7 @@
               <w:lang w:eastAsia="en-ZA"/>
             </w:rPr>
           </w:pPr>
-          <w:hyperlink w:anchor="_Toc241819345" w:history="1">
+          <w:hyperlink w:anchor="_Toc242125109" w:history="1">
             <w:r>
               <w:rPr>
                 <w:rStyle w:val="Hyperlink"/>
@@ -840,7 +842,7 @@
                 <w:noProof/>
                 <w:webHidden/>
               </w:rPr>
-              <w:instrText xml:space="preserve"> PAGEREF _Toc241819345 \h </w:instrText>
+              <w:instrText xml:space="preserve"> PAGEREF _Toc242125109 \h </w:instrText>
             </w:r>
             <w:r>
               <w:rPr>
@@ -885,7 +887,7 @@
               <w:lang w:eastAsia="en-ZA"/>
             </w:rPr>
           </w:pPr>
-          <w:hyperlink w:anchor="_Toc241819346" w:history="1">
+          <w:hyperlink w:anchor="_Toc242125110" w:history="1">
             <w:r>
               <w:rPr>
                 <w:rStyle w:val="Hyperlink"/>
@@ -912,7 +914,7 @@
                 <w:noProof/>
                 <w:webHidden/>
               </w:rPr>
-              <w:instrText xml:space="preserve"> PAGEREF _Toc241819346 \h </w:instrText>
+              <w:instrText xml:space="preserve"> PAGEREF _Toc242125110 \h </w:instrText>
             </w:r>
             <w:r>
               <w:rPr>
@@ -957,7 +959,7 @@
               <w:lang w:eastAsia="en-ZA"/>
             </w:rPr>
           </w:pPr>
-          <w:hyperlink w:anchor="_Toc241819347" w:history="1">
+          <w:hyperlink w:anchor="_Toc242125111" w:history="1">
             <w:r>
               <w:rPr>
                 <w:rStyle w:val="Hyperlink"/>
@@ -984,7 +986,7 @@
                 <w:noProof/>
                 <w:webHidden/>
               </w:rPr>
-              <w:instrText xml:space="preserve"> PAGEREF _Toc241819347 \h </w:instrText>
+              <w:instrText xml:space="preserve"> PAGEREF _Toc242125111 \h </w:instrText>
             </w:r>
             <w:r>
               <w:rPr>
@@ -1029,7 +1031,7 @@
               <w:lang w:eastAsia="en-ZA"/>
             </w:rPr>
           </w:pPr>
-          <w:hyperlink w:anchor="_Toc241819348" w:history="1">
+          <w:hyperlink w:anchor="_Toc242125112" w:history="1">
             <w:r>
               <w:rPr>
                 <w:rStyle w:val="Hyperlink"/>
@@ -1056,7 +1058,7 @@
                 <w:noProof/>
                 <w:webHidden/>
               </w:rPr>
-              <w:instrText xml:space="preserve"> PAGEREF _Toc241819348 \h </w:instrText>
+              <w:instrText xml:space="preserve"> PAGEREF _Toc242125112 \h </w:instrText>
             </w:r>
             <w:r>
               <w:rPr>
@@ -1101,7 +1103,7 @@
               <w:lang w:eastAsia="en-ZA"/>
             </w:rPr>
           </w:pPr>
-          <w:hyperlink w:anchor="_Toc241819349" w:history="1">
+          <w:hyperlink w:anchor="_Toc242125113" w:history="1">
             <w:r>
               <w:rPr>
                 <w:rStyle w:val="Hyperlink"/>
@@ -1128,7 +1130,7 @@
                 <w:noProof/>
                 <w:webHidden/>
               </w:rPr>
-              <w:instrText xml:space="preserve"> PAGEREF _Toc241819349 \h </w:instrText>
+              <w:instrText xml:space="preserve"> PAGEREF _Toc242125113 \h </w:instrText>
             </w:r>
             <w:r>
               <w:rPr>
@@ -1173,7 +1175,7 @@
               <w:lang w:eastAsia="en-ZA"/>
             </w:rPr>
           </w:pPr>
-          <w:hyperlink w:anchor="_Toc241819350" w:history="1">
+          <w:hyperlink w:anchor="_Toc242125114" w:history="1">
             <w:r>
               <w:rPr>
                 <w:rStyle w:val="Hyperlink"/>
@@ -1200,7 +1202,7 @@
                 <w:noProof/>
                 <w:webHidden/>
               </w:rPr>
-              <w:instrText xml:space="preserve"> PAGEREF _Toc241819350 \h </w:instrText>
+              <w:instrText xml:space="preserve"> PAGEREF _Toc242125114 \h </w:instrText>
             </w:r>
             <w:r>
               <w:rPr>
@@ -1245,7 +1247,7 @@
               <w:lang w:eastAsia="en-ZA"/>
             </w:rPr>
           </w:pPr>
-          <w:hyperlink w:anchor="_Toc241819351" w:history="1">
+          <w:hyperlink w:anchor="_Toc242125115" w:history="1">
             <w:r>
               <w:rPr>
                 <w:rStyle w:val="Hyperlink"/>
@@ -1272,7 +1274,7 @@
                 <w:noProof/>
                 <w:webHidden/>
               </w:rPr>
-              <w:instrText xml:space="preserve"> PAGEREF _Toc241819351 \h </w:instrText>
+              <w:instrText xml:space="preserve"> PAGEREF _Toc242125115 \h </w:instrText>
             </w:r>
             <w:r>
               <w:rPr>
@@ -1317,7 +1319,7 @@
               <w:lang w:eastAsia="en-ZA"/>
             </w:rPr>
           </w:pPr>
-          <w:hyperlink w:anchor="_Toc241819352" w:history="1">
+          <w:hyperlink w:anchor="_Toc242125116" w:history="1">
             <w:r>
               <w:rPr>
                 <w:rStyle w:val="Hyperlink"/>
@@ -1344,7 +1346,7 @@
                 <w:noProof/>
                 <w:webHidden/>
               </w:rPr>
-              <w:instrText xml:space="preserve"> PAGEREF _Toc241819352 \h </w:instrText>
+              <w:instrText xml:space="preserve"> PAGEREF _Toc242125116 \h </w:instrText>
             </w:r>
             <w:r>
               <w:rPr>
@@ -1389,7 +1391,7 @@
               <w:lang w:eastAsia="en-ZA"/>
             </w:rPr>
           </w:pPr>
-          <w:hyperlink w:anchor="_Toc241819353" w:history="1">
+          <w:hyperlink w:anchor="_Toc242125117" w:history="1">
             <w:r>
               <w:rPr>
                 <w:rStyle w:val="Hyperlink"/>
@@ -1416,7 +1418,7 @@
                 <w:noProof/>
                 <w:webHidden/>
               </w:rPr>
-              <w:instrText xml:space="preserve"> PAGEREF _Toc241819353 \h </w:instrText>
+              <w:instrText xml:space="preserve"> PAGEREF _Toc242125117 \h </w:instrText>
             </w:r>
             <w:r>
               <w:rPr>
@@ -1461,7 +1463,7 @@
               <w:lang w:eastAsia="en-ZA"/>
             </w:rPr>
           </w:pPr>
-          <w:hyperlink w:anchor="_Toc241819354" w:history="1">
+          <w:hyperlink w:anchor="_Toc242125118" w:history="1">
             <w:r>
               <w:rPr>
                 <w:rStyle w:val="Hyperlink"/>
@@ -1488,7 +1490,7 @@
                 <w:noProof/>
                 <w:webHidden/>
               </w:rPr>
-              <w:instrText xml:space="preserve"> PAGEREF _Toc241819354 \h </w:instrText>
+              <w:instrText xml:space="preserve"> PAGEREF _Toc242125118 \h </w:instrText>
             </w:r>
             <w:r>
               <w:rPr>
@@ -1533,7 +1535,7 @@
               <w:lang w:eastAsia="en-ZA"/>
             </w:rPr>
           </w:pPr>
-          <w:hyperlink w:anchor="_Toc241819355" w:history="1">
+          <w:hyperlink w:anchor="_Toc242125119" w:history="1">
             <w:r>
               <w:rPr>
                 <w:rStyle w:val="Hyperlink"/>
@@ -1560,7 +1562,7 @@
                 <w:noProof/>
                 <w:webHidden/>
               </w:rPr>
-              <w:instrText xml:space="preserve"> PAGEREF _Toc241819355 \h </w:instrText>
+              <w:instrText xml:space="preserve"> PAGEREF _Toc242125119 \h </w:instrText>
             </w:r>
             <w:r>
               <w:rPr>
@@ -1605,7 +1607,7 @@
               <w:lang w:eastAsia="en-ZA"/>
             </w:rPr>
           </w:pPr>
-          <w:hyperlink w:anchor="_Toc241819356" w:history="1">
+          <w:hyperlink w:anchor="_Toc242125120" w:history="1">
             <w:r>
               <w:rPr>
                 <w:rStyle w:val="Hyperlink"/>
@@ -1632,7 +1634,7 @@
                 <w:noProof/>
                 <w:webHidden/>
               </w:rPr>
-              <w:instrText xml:space="preserve"> PAGEREF _Toc241819356 \h </w:instrText>
+              <w:instrText xml:space="preserve"> PAGEREF _Toc242125120 \h </w:instrText>
             </w:r>
             <w:r>
               <w:rPr>
@@ -1652,7 +1654,7 @@
                 <w:noProof/>
                 <w:webHidden/>
               </w:rPr>
-              <w:t>7</w:t>
+              <w:t>8</w:t>
             </w:r>
             <w:r>
               <w:rPr>
@@ -1677,7 +1679,7 @@
               <w:lang w:eastAsia="en-ZA"/>
             </w:rPr>
           </w:pPr>
-          <w:hyperlink w:anchor="_Toc241819357" w:history="1">
+          <w:hyperlink w:anchor="_Toc242125121" w:history="1">
             <w:r>
               <w:rPr>
                 <w:rStyle w:val="Hyperlink"/>
@@ -1704,7 +1706,7 @@
                 <w:noProof/>
                 <w:webHidden/>
               </w:rPr>
-              <w:instrText xml:space="preserve"> PAGEREF _Toc241819357 \h </w:instrText>
+              <w:instrText xml:space="preserve"> PAGEREF _Toc242125121 \h </w:instrText>
             </w:r>
             <w:r>
               <w:rPr>
@@ -1724,7 +1726,7 @@
                 <w:noProof/>
                 <w:webHidden/>
               </w:rPr>
-              <w:t>7</w:t>
+              <w:t>8</w:t>
             </w:r>
             <w:r>
               <w:rPr>
@@ -1749,7 +1751,7 @@
               <w:lang w:eastAsia="en-ZA"/>
             </w:rPr>
           </w:pPr>
-          <w:hyperlink w:anchor="_Toc241819358" w:history="1">
+          <w:hyperlink w:anchor="_Toc242125122" w:history="1">
             <w:r>
               <w:rPr>
                 <w:rStyle w:val="Hyperlink"/>
@@ -1776,7 +1778,7 @@
                 <w:noProof/>
                 <w:webHidden/>
               </w:rPr>
-              <w:instrText xml:space="preserve"> PAGEREF _Toc241819358 \h </w:instrText>
+              <w:instrText xml:space="preserve"> PAGEREF _Toc242125122 \h </w:instrText>
             </w:r>
             <w:r>
               <w:rPr>
@@ -1796,7 +1798,7 @@
                 <w:noProof/>
                 <w:webHidden/>
               </w:rPr>
-              <w:t>7</w:t>
+              <w:t>8</w:t>
             </w:r>
             <w:r>
               <w:rPr>
@@ -1828,7 +1830,7 @@
       <w:pPr>
         <w:pStyle w:val="Heading2"/>
       </w:pPr>
-      <w:bookmarkStart w:id="0" w:name="_Toc241819335"/>
+      <w:bookmarkStart w:id="0" w:name="_Toc242125099"/>
       <w:r>
         <w:lastRenderedPageBreak/>
         <w:t>1. Introduction</w:t>
@@ -1839,7 +1841,7 @@
       <w:pPr>
         <w:pStyle w:val="Heading3"/>
       </w:pPr>
-      <w:bookmarkStart w:id="1" w:name="_Toc241819336"/>
+      <w:bookmarkStart w:id="1" w:name="_Toc242125100"/>
       <w:r>
         <w:t>1.1 Background</w:t>
       </w:r>
@@ -1860,7 +1862,7 @@
       <w:pPr>
         <w:pStyle w:val="Heading3"/>
       </w:pPr>
-      <w:bookmarkStart w:id="2" w:name="_Toc241819337"/>
+      <w:bookmarkStart w:id="2" w:name="_Toc242125101"/>
       <w:r>
         <w:t>1.2 Related Work</w:t>
       </w:r>
@@ -1945,7 +1947,7 @@
       <w:pPr>
         <w:pStyle w:val="Heading3"/>
       </w:pPr>
-      <w:bookmarkStart w:id="3" w:name="_Toc241819338"/>
+      <w:bookmarkStart w:id="3" w:name="_Toc242125102"/>
       <w:r>
         <w:t>1.3 Problem Statement</w:t>
       </w:r>
@@ -1984,7 +1986,7 @@
       <w:pPr>
         <w:pStyle w:val="Heading3"/>
       </w:pPr>
-      <w:bookmarkStart w:id="4" w:name="_Toc241819339"/>
+      <w:bookmarkStart w:id="4" w:name="_Toc242125103"/>
       <w:r>
         <w:t>1.4 Aim and Objectives</w:t>
       </w:r>
@@ -2066,7 +2068,7 @@
       <w:pPr>
         <w:pStyle w:val="Heading3"/>
       </w:pPr>
-      <w:bookmarkStart w:id="5" w:name="_Toc241819340"/>
+      <w:bookmarkStart w:id="5" w:name="_Toc242125104"/>
       <w:r>
         <w:t>1.5 Significance of the Project</w:t>
       </w:r>
@@ -2108,7 +2110,7 @@
       <w:pPr>
         <w:pStyle w:val="Heading2"/>
       </w:pPr>
-      <w:bookmarkStart w:id="6" w:name="_Toc241819341"/>
+      <w:bookmarkStart w:id="6" w:name="_Toc242125105"/>
       <w:r>
         <w:t>2. Methodology</w:t>
       </w:r>
@@ -2118,7 +2120,7 @@
       <w:pPr>
         <w:pStyle w:val="Heading3"/>
       </w:pPr>
-      <w:bookmarkStart w:id="7" w:name="_Toc241819342"/>
+      <w:bookmarkStart w:id="7" w:name="_Toc242125106"/>
       <w:r>
         <w:t>2.1 Tools Used</w:t>
       </w:r>
@@ -2135,7 +2137,13 @@
         <w:t>Python 3.13.15</w:t>
       </w:r>
       <w:r>
-        <w:t xml:space="preserve"> chosen for it’s robust data handling capabilities. The </w:t>
+        <w:t xml:space="preserve"> chosen for </w:t>
+      </w:r>
+      <w:r>
+        <w:t>it is</w:t>
+      </w:r>
+      <w:r>
+        <w:t xml:space="preserve"> robust data handling capabilities. The </w:t>
       </w:r>
       <w:r>
         <w:rPr>
@@ -2154,7 +2162,7 @@
       <w:pPr>
         <w:pStyle w:val="Heading3"/>
       </w:pPr>
-      <w:bookmarkStart w:id="8" w:name="_Toc241819343"/>
+      <w:bookmarkStart w:id="8" w:name="_Toc242125107"/>
       <w:r>
         <w:lastRenderedPageBreak/>
         <w:t>2.2 Simulator Flow Diagram</w:t>
@@ -2216,7 +2224,7 @@
       <w:pPr>
         <w:pStyle w:val="Heading3"/>
       </w:pPr>
-      <w:bookmarkStart w:id="9" w:name="_Toc241819344"/>
+      <w:bookmarkStart w:id="9" w:name="_Toc242125108"/>
       <w:r>
         <w:t>2.3 Algorithms Defined</w:t>
       </w:r>
@@ -2353,14 +2361,28 @@
           <w:i/>
           <w:iCs/>
         </w:rPr>
-        <w:t>Operating System principles, this simulator implements the three explicitly listed algorithms. The ‘Priority’ attribute is generated for each process to maintain data structure completeness ‘Time Quantum’ expiration, as per their canonical definitions.</w:t>
+        <w:t xml:space="preserve">Operating System principles, this simulator implements the three explicitly listed algorithms. The ‘Priority’ attribute is generated for each process to maintain data structure completeness ‘Time Quantum’ expiration, as per their </w:t>
+      </w:r>
+      <w:r>
+        <w:rPr>
+          <w:i/>
+          <w:iCs/>
+        </w:rPr>
+        <w:t>standard</w:t>
+      </w:r>
+      <w:r>
+        <w:rPr>
+          <w:i/>
+          <w:iCs/>
+        </w:rPr>
+        <w:t xml:space="preserve"> definitions.</w:t>
       </w:r>
     </w:p>
     <w:p>
       <w:pPr>
         <w:pStyle w:val="Heading3"/>
       </w:pPr>
-      <w:bookmarkStart w:id="10" w:name="_Toc241819345"/>
+      <w:bookmarkStart w:id="10" w:name="_Toc242125109"/>
       <w:r>
         <w:t>2.4 Performance Metrics and Formulae</w:t>
       </w:r>
@@ -2435,7 +2457,7 @@
       <w:pPr>
         <w:pStyle w:val="Heading3"/>
       </w:pPr>
-      <w:bookmarkStart w:id="11" w:name="_Toc241819346"/>
+      <w:bookmarkStart w:id="11" w:name="_Toc242125110"/>
       <w:r>
         <w:t>2.5 Data Collection Methods</w:t>
       </w:r>
@@ -2450,7 +2472,7 @@
       <w:pPr>
         <w:pStyle w:val="Heading3"/>
       </w:pPr>
-      <w:bookmarkStart w:id="12" w:name="_Toc241819347"/>
+      <w:bookmarkStart w:id="12" w:name="_Toc242125111"/>
       <w:r>
         <w:t>2.6 Data Analysis Tool</w:t>
       </w:r>
@@ -2465,7 +2487,7 @@
       <w:pPr>
         <w:pStyle w:val="Heading2"/>
       </w:pPr>
-      <w:bookmarkStart w:id="13" w:name="_Toc241819348"/>
+      <w:bookmarkStart w:id="13" w:name="_Toc242125112"/>
       <w:r>
         <w:lastRenderedPageBreak/>
         <w:t>3. Results and Analysis</w:t>
@@ -2521,7 +2543,7 @@
       </w:r>
     </w:p>
     <w:p>
-      <w:bookmarkStart w:id="14" w:name="_Toc241819349"/>
+      <w:bookmarkStart w:id="14" w:name="_Toc242125113"/>
       <w:r>
         <w:rPr>
           <w:rStyle w:val="Heading3Char"/>
@@ -2537,7 +2559,7 @@
       </w:r>
     </w:p>
     <w:p>
-      <w:bookmarkStart w:id="15" w:name="_Toc241819350"/>
+      <w:bookmarkStart w:id="15" w:name="_Toc242125114"/>
       <w:r>
         <w:rPr>
           <w:rStyle w:val="Heading3Char"/>
@@ -2583,7 +2605,7 @@
       </w:r>
     </w:p>
     <w:p>
-      <w:bookmarkStart w:id="16" w:name="_Toc241819351"/>
+      <w:bookmarkStart w:id="16" w:name="_Toc242125115"/>
       <w:r>
         <w:rPr>
           <w:rStyle w:val="Heading3Char"/>
@@ -2616,7 +2638,7 @@
       </w:r>
     </w:p>
     <w:p>
-      <w:bookmarkStart w:id="17" w:name="_Toc241819352"/>
+      <w:bookmarkStart w:id="17" w:name="_Toc242125116"/>
       <w:r>
         <w:rPr>
           <w:rStyle w:val="Heading3Char"/>
@@ -2714,7 +2736,7 @@
       <w:pPr>
         <w:pStyle w:val="Heading2"/>
       </w:pPr>
-      <w:bookmarkStart w:id="18" w:name="_Toc241819353"/>
+      <w:bookmarkStart w:id="18" w:name="_Toc242125117"/>
       <w:r>
         <w:t>4. Discussion</w:t>
       </w:r>
@@ -2724,94 +2746,233 @@
       <w:pPr>
         <w:pStyle w:val="Heading3"/>
       </w:pPr>
-      <w:bookmarkStart w:id="19" w:name="_Toc241819354"/>
+      <w:bookmarkStart w:id="19" w:name="_Toc242125118"/>
       <w:r>
         <w:t>4.1 Findings on Performance Metrics</w:t>
       </w:r>
       <w:bookmarkEnd w:id="19"/>
     </w:p>
     <w:p>
+      <w:pPr>
+        <w:pStyle w:val="Heading4"/>
+      </w:pPr>
+      <w:r>
+        <w:t>1. Which algorithm minimises waiting time?</w:t>
+      </w:r>
+    </w:p>
+    <w:p>
+      <w:r>
+        <w:t xml:space="preserve">Shortest Remaining Time First (SRTF) consistently minimises the average waiting time across all process loads. As demonstrated in the results, SRTF’s </w:t>
+      </w:r>
+      <w:r>
+        <w:t>pre-emptive</w:t>
+      </w:r>
+      <w:r>
+        <w:t xml:space="preserve"> nature ensures that processes with the shortest remaining execution times are prioritized. This prevents short processes from being trapped behind long ones, effectively eliminating the "convoy effect" that severely inflates waiting times in First-Come, First-Served (FCFS).</w:t>
+      </w:r>
+    </w:p>
+    <w:p>
+      <w:pPr>
+        <w:pStyle w:val="Heading4"/>
+      </w:pPr>
+      <w:r>
+        <w:t>2. Which algorithm gives the best turnaround time?</w:t>
+      </w:r>
+    </w:p>
+    <w:p>
+      <w:r>
+        <w:t>SRTF also yields the best (lowest) average turnaround time. Because Turnaround Time is mathematically defined as Waiting Time plus Burst Time, and the total Burst Time for a given workload remains constant regardless of the scheduling algorithm, the algorithm that minimises waiting time will inherently minimise turnaround time. Therefore, SRTF’s superiority in waiting time directly translates to optimal turnaround performance.</w:t>
+      </w:r>
+    </w:p>
+    <w:p>
+      <w:pPr>
+        <w:pStyle w:val="Heading4"/>
+      </w:pPr>
+      <w:r>
+        <w:t>3. Which algorithm performs best in terms of Response Time?</w:t>
+      </w:r>
+    </w:p>
+    <w:p>
+      <w:r>
+        <w:t>Round Robin (RR) and SRTF perform best in terms of response time, with RR offering the most predictable performance. Response time measures the interval from a process's arrival to its first execution on the CPU. RR guarantees a low response time because every process is serviced within its first time quantum, ensuring immediate initial feedback. SRTF also performs well by quickly executing newly arrived short processes. Conversely, FCFS exhibits poor response times, as a process must wait for all previously arrived processes to complete entirely before receiving its first CPU cycle.</w:t>
+      </w:r>
+    </w:p>
+    <w:p>
+      <w:pPr>
+        <w:pStyle w:val="Heading4"/>
+      </w:pPr>
+      <w:r>
+        <w:t>4. Which algorithm demonstrates higher throughput?</w:t>
+      </w:r>
+    </w:p>
+    <w:p>
+      <w:r>
+        <w:t xml:space="preserve">SRTF demonstrates the highest throughput. Throughput is calculated as the total number of processes completed per unit of time. By continuously prioritizing and rapidly clearing the shortest processes, SRTF maximizes the total count of finished tasks within the overall execution </w:t>
+      </w:r>
+      <w:r>
+        <w:t>time</w:t>
+      </w:r>
+      <w:r>
+        <w:t>, outperforming both FCFS and RR.</w:t>
+      </w:r>
+    </w:p>
+    <w:p>
+      <w:pPr>
+        <w:pStyle w:val="Heading4"/>
+      </w:pPr>
+      <w:r>
+        <w:t>5. Which algorithm demonstrates higher CPU utilisation?</w:t>
+      </w:r>
+    </w:p>
+    <w:p>
+      <w:r>
+        <w:t xml:space="preserve">All three algorithms demonstrate comparably high CPU utilisation (approaching 100% across the tested workloads). Because the simulated workload generator creates processes with continuous, overlapping arrival times, the CPU is rarely left idle. However, theoretically, the </w:t>
+      </w:r>
+      <w:r>
+        <w:t>pre-emptive</w:t>
+      </w:r>
+      <w:r>
+        <w:t xml:space="preserve"> algorithms (SRTF and RR) maintain a marginal advantage in CPU utilisation. By immediately </w:t>
+      </w:r>
+      <w:r>
+        <w:t>pre-empting</w:t>
+      </w:r>
+      <w:r>
+        <w:t xml:space="preserve"> a finishing process to start the next ready process, they eliminate the micro-idle gaps that can occasionally occur in the non-</w:t>
+      </w:r>
+      <w:r>
+        <w:t>pre-emptive</w:t>
+      </w:r>
+      <w:r>
+        <w:t xml:space="preserve"> FCFS model.</w:t>
+      </w:r>
+    </w:p>
+    <w:p>
+      <w:pPr>
+        <w:pStyle w:val="Heading3"/>
+      </w:pPr>
+      <w:bookmarkStart w:id="20" w:name="_Toc242125119"/>
+      <w:r>
+        <w:t>4.2 Strengths and Weaknesses</w:t>
+      </w:r>
+      <w:bookmarkEnd w:id="20"/>
+    </w:p>
+    <w:p>
+      <w:r>
+        <w:t>FCFS: Strength: Simple, low overhead. Weakness: Convoy effect, high response time.</w:t>
+      </w:r>
+    </w:p>
+    <w:p>
+      <w:r>
+        <w:t>SRTF: Strength: Optimal waiting/turnaround time. Weakness: Starvation of long processes, high context-switch overhead if not managed.</w:t>
+      </w:r>
+    </w:p>
+    <w:p>
+      <w:r>
+        <w:lastRenderedPageBreak/>
+        <w:t>RR: Strength: Excellent fairness and predictable response time. Weakness: Throughput drops if time quantum is too small (excessive context switching).</w:t>
+      </w:r>
+    </w:p>
+    <w:p>
+      <w:pPr>
+        <w:pStyle w:val="Heading3"/>
+      </w:pPr>
+      <w:bookmarkStart w:id="21" w:name="_Toc242125120"/>
+      <w:r>
+        <w:t>4.3 Area of Application</w:t>
+      </w:r>
+      <w:bookmarkEnd w:id="21"/>
+    </w:p>
+    <w:p>
+      <w:r>
+        <w:t xml:space="preserve"> For Audio-and-Video systems, Round Robin (with a tuned time quantum) or SRTF is the best-performing algorithm. A/V systems prioritize low Response Time to ensure immediate playback initiation and prevent buffer starvation, which RR and SRTF provide, unlike FCFS.</w:t>
+      </w:r>
       <w:r>
         <w:t xml:space="preserve"> </w:t>
       </w:r>
       <w:r>
         <w:rPr>
-          <w:color w:val="EE0000"/>
-        </w:rPr>
-        <w:t>Directly answer the 5 investigative questions from the prompt. (e.g., "SRTF minimizes waiting time and gives the best turnaround time. RR demonstrates highly competitive response time...").</w:t>
-      </w:r>
-    </w:p>
-    <w:p>
-      <w:pPr>
-        <w:pStyle w:val="Heading3"/>
-      </w:pPr>
-      <w:bookmarkStart w:id="20" w:name="_Toc241819355"/>
-      <w:r>
-        <w:t>4.2 Strengths and Weaknesses</w:t>
-      </w:r>
-      <w:bookmarkEnd w:id="20"/>
-    </w:p>
-    <w:p>
-      <w:r>
-        <w:t>FCFS: Strength: Simple, low overhead. Weakness: Convoy effect, high response time.</w:t>
-      </w:r>
-    </w:p>
-    <w:p>
-      <w:r>
-        <w:t>SRTF: Strength: Optimal waiting/turnaround time. Weakness: Starvation of long processes, high context-switch overhead if not managed.</w:t>
-      </w:r>
-    </w:p>
-    <w:p>
-      <w:r>
-        <w:t>RR: Strength: Excellent fairness and predictable response time. Weakness: Throughput drops if time quantum is too small (excessive context switching).</w:t>
-      </w:r>
-    </w:p>
-    <w:p>
-      <w:pPr>
-        <w:pStyle w:val="Heading3"/>
-      </w:pPr>
-      <w:bookmarkStart w:id="21" w:name="_Toc241819356"/>
-      <w:r>
-        <w:t>4.3 Area of Application</w:t>
-      </w:r>
-      <w:bookmarkEnd w:id="21"/>
-    </w:p>
-    <w:p>
-      <w:r>
-        <w:t xml:space="preserve"> For Audio-and-Video systems, Round Robin (with a tuned time quantum) or SRTF is the best-performing algorithm. A/V systems prioritize low Response Time to ensure immediate playback initiation and prevent buffer starvation, which RR and SRTF provide, unlike FCFS.</w:t>
-      </w:r>
-      <w:r>
+          <w:lang w:val="en-US"/>
+        </w:rPr>
+        <w:t>If an audio decoding thread or a video rendering thread is served of CPU time as can happen in SRT</w:t>
+      </w:r>
+      <w:r>
+        <w:rPr>
+          <w:lang w:val="en-US"/>
+        </w:rPr>
+        <w:t>F</w:t>
+      </w:r>
+      <w:r>
+        <w:rPr>
+          <w:lang w:val="en-US"/>
+        </w:rPr>
         <w:t xml:space="preserve"> </w:t>
       </w:r>
       <w:r>
         <w:rPr>
           <w:lang w:val="en-US"/>
         </w:rPr>
-        <w:t>If an audio decoding thread or a video rendering thread is served of CPU time as can happen in SRT</w:t>
+        <w:t>(</w:t>
       </w:r>
       <w:r>
         <w:rPr>
           <w:lang w:val="en-US"/>
         </w:rPr>
-        <w:t>F</w:t>
+        <w:t>if many short processes arrive</w:t>
       </w:r>
       <w:r>
         <w:rPr>
           <w:lang w:val="en-US"/>
         </w:rPr>
-        <w:t xml:space="preserve"> </w:t>
+        <w:t>)</w:t>
       </w:r>
       <w:r>
         <w:rPr>
           <w:lang w:val="en-US"/>
         </w:rPr>
+        <w:t>, it results in dropped frames of audio chattering. Round Robin guarantees that every thread gets a regular slice of CPU time, ensuring smooth, continuous media playback without starvation, making it the most robust choice for soft real time audio or video environment</w:t>
+      </w:r>
+      <w:r>
+        <w:rPr>
+          <w:lang w:val="en-US"/>
+        </w:rPr>
+        <w:t>s</w:t>
+      </w:r>
+      <w:r>
+        <w:rPr>
+          <w:lang w:val="en-US"/>
+        </w:rPr>
+        <w:t>.</w:t>
+      </w:r>
+    </w:p>
+    <w:p>
+      <w:pPr>
+        <w:pStyle w:val="Heading2"/>
+      </w:pPr>
+      <w:bookmarkStart w:id="22" w:name="_Toc242125121"/>
+      <w:r>
+        <w:t>5. Conclusion</w:t>
+      </w:r>
+      <w:bookmarkEnd w:id="22"/>
+    </w:p>
+    <w:p>
+      <w:r>
+        <w:rPr>
+          <w:lang w:val="en-US"/>
+        </w:rPr>
+        <w:t xml:space="preserve">This project successfully developed a discrete event simulator to evaluate the performance of FCFS, SRTF, and round Robin CPU scheduling algorithms under scaling workloads </w:t>
+      </w:r>
+      <w:r>
+        <w:rPr>
+          <w:lang w:val="en-US"/>
+        </w:rPr>
         <w:t>(</w:t>
       </w:r>
       <w:r>
         <w:rPr>
           <w:lang w:val="en-US"/>
         </w:rPr>
-        <w:t>if many short processes arrive</w:t>
+        <w:t>10 to 50 processors</w:t>
       </w:r>
       <w:r>
         <w:rPr>
@@ -2823,130 +2984,76 @@
         <w:rPr>
           <w:lang w:val="en-US"/>
         </w:rPr>
-        <w:t>, it results in dropped frames of audio chattering. Round Robin guarantees that every thread gets a regular slice of CPU time, ensuring smooth, continuous media playback without starvation, making it the most robust choice for soft real time audio or video environment</w:t>
+        <w:t xml:space="preserve">. The quantitative analysis revealed that while SRTF is mathematically superior in minimizing waiting time, </w:t>
       </w:r>
       <w:r>
         <w:rPr>
           <w:lang w:val="en-US"/>
         </w:rPr>
-        <w:t>s</w:t>
+        <w:t>turnaround</w:t>
       </w:r>
       <w:r>
         <w:rPr>
           <w:lang w:val="en-US"/>
         </w:rPr>
+        <w:t xml:space="preserve"> time and maximizing throughput, round Robin provides the most stable and predictable response times. </w:t>
+      </w:r>
+      <w:r>
+        <w:rPr>
+          <w:lang w:val="en-US"/>
+        </w:rPr>
+        <w:t>For a</w:t>
+      </w:r>
+      <w:r>
+        <w:rPr>
+          <w:lang w:val="en-US"/>
+        </w:rPr>
+        <w:t xml:space="preserve">udio and video systems, we're preventing buffer starvation and maintaining low response times are critical to user experience, round Robin images as the most suitable and reliable scheduling accolading. The simulator </w:t>
+      </w:r>
+      <w:r>
+        <w:rPr>
+          <w:lang w:val="en-US"/>
+        </w:rPr>
+        <w:t>m</w:t>
+      </w:r>
+      <w:r>
+        <w:rPr>
+          <w:lang w:val="en-US"/>
+        </w:rPr>
+        <w:t>et all project objective</w:t>
+      </w:r>
+      <w:r>
+        <w:rPr>
+          <w:lang w:val="en-US"/>
+        </w:rPr>
+        <w:t xml:space="preserve">s, </w:t>
+      </w:r>
+      <w:r>
+        <w:rPr>
+          <w:lang w:val="en-US"/>
+        </w:rPr>
+        <w:t xml:space="preserve">providing each </w:t>
+      </w:r>
+      <w:r>
+        <w:rPr>
+          <w:lang w:val="en-US"/>
+        </w:rPr>
+        <w:t xml:space="preserve">clear, </w:t>
+      </w:r>
+      <w:r>
+        <w:rPr>
+          <w:lang w:val="en-US"/>
+        </w:rPr>
+        <w:t>empirical basis for algorithm selection in multimedia computing</w:t>
+      </w:r>
+      <w:r>
+        <w:rPr>
+          <w:lang w:val="en-US"/>
+        </w:rPr>
         <w:t>.</w:t>
       </w:r>
     </w:p>
-    <w:p>
-      <w:pPr>
-        <w:pStyle w:val="Heading2"/>
-      </w:pPr>
-      <w:bookmarkStart w:id="22" w:name="_Toc241819357"/>
-      <w:r>
-        <w:t>5. Conclusion</w:t>
-      </w:r>
-      <w:bookmarkEnd w:id="22"/>
-    </w:p>
-    <w:p>
-      <w:r>
-        <w:rPr>
-          <w:lang w:val="en-US"/>
-        </w:rPr>
-        <w:t xml:space="preserve">This project successfully developed a discrete event simulator to evaluate the performance of FCFS, SRTF, and round Robin CPU scheduling algorithms under scaling workloads </w:t>
-      </w:r>
-      <w:r>
-        <w:rPr>
-          <w:lang w:val="en-US"/>
-        </w:rPr>
-        <w:t>(</w:t>
-      </w:r>
-      <w:r>
-        <w:rPr>
-          <w:lang w:val="en-US"/>
-        </w:rPr>
-        <w:t>10 to 50 processors</w:t>
-      </w:r>
-      <w:r>
-        <w:rPr>
-          <w:lang w:val="en-US"/>
-        </w:rPr>
-        <w:t>)</w:t>
-      </w:r>
-      <w:r>
-        <w:rPr>
-          <w:lang w:val="en-US"/>
-        </w:rPr>
-        <w:t xml:space="preserve">. The quantitative analysis revealed that while SRTF is mathematically superior in minimizing waiting time, </w:t>
-      </w:r>
-      <w:r>
-        <w:rPr>
-          <w:lang w:val="en-US"/>
-        </w:rPr>
-        <w:t>turnaround</w:t>
-      </w:r>
-      <w:r>
-        <w:rPr>
-          <w:lang w:val="en-US"/>
-        </w:rPr>
-        <w:t xml:space="preserve"> time and maximizing throughput, round Robin provides the most stable and predictable response times. </w:t>
-      </w:r>
-      <w:r>
-        <w:rPr>
-          <w:lang w:val="en-US"/>
-        </w:rPr>
-        <w:t>For a</w:t>
-      </w:r>
-      <w:r>
-        <w:rPr>
-          <w:lang w:val="en-US"/>
-        </w:rPr>
-        <w:t xml:space="preserve">udio and video systems, we're preventing buffer starvation and maintaining low response times are critical to user experience, round Robin images as the most suitable and reliable scheduling accolading. The simulator </w:t>
-      </w:r>
-      <w:r>
-        <w:rPr>
-          <w:lang w:val="en-US"/>
-        </w:rPr>
-        <w:t>m</w:t>
-      </w:r>
-      <w:r>
-        <w:rPr>
-          <w:lang w:val="en-US"/>
-        </w:rPr>
-        <w:t>et all project objective</w:t>
-      </w:r>
-      <w:r>
-        <w:rPr>
-          <w:lang w:val="en-US"/>
-        </w:rPr>
-        <w:t xml:space="preserve">s, </w:t>
-      </w:r>
-      <w:r>
-        <w:rPr>
-          <w:lang w:val="en-US"/>
-        </w:rPr>
-        <w:t xml:space="preserve">providing each </w:t>
-      </w:r>
-      <w:r>
-        <w:rPr>
-          <w:lang w:val="en-US"/>
-        </w:rPr>
-        <w:t xml:space="preserve">clear, </w:t>
-      </w:r>
-      <w:r>
-        <w:rPr>
-          <w:lang w:val="en-US"/>
-        </w:rPr>
-        <w:t>empirical basis for algorithm selection in multimedia computing</w:t>
-      </w:r>
-      <w:r>
-        <w:rPr>
-          <w:lang w:val="en-US"/>
-        </w:rPr>
-        <w:t>.</w:t>
-      </w:r>
-    </w:p>
-    <w:bookmarkStart w:id="23" w:name="_Toc241819358" w:displacedByCustomXml="next"/>
+    <w:bookmarkStart w:id="23" w:name="_Toc242125122" w:displacedByCustomXml="next"/>
     <w:sdt>
       <w:sdtPr>
         <w:rPr>
@@ -4067,7 +4174,6 @@
     <w:next w:val="Normal"/>
     <w:link w:val="Heading4Char"/>
     <w:uiPriority w:val="9"/>
-    <w:semiHidden/>
     <w:unhideWhenUsed/>
     <w:qFormat/>
     <w:rsid w:val="00AA6F4C"/>
@@ -4264,7 +4370,6 @@
     <w:basedOn w:val="DefaultParagraphFont"/>
     <w:link w:val="Heading4"/>
     <w:uiPriority w:val="9"/>
-    <w:semiHidden/>
     <w:rsid w:val="00AA6F4C"/>
     <w:rPr>
       <w:rFonts w:eastAsiaTheme="majorEastAsia" w:cstheme="majorBidi"/>

</xml_diff>

<commit_message>
Final edits of the Reseach Report
</commit_message>
<xml_diff>
--- a/report/Research Report.docx
+++ b/report/Research Report.docx
@@ -3195,17 +3195,6 @@
         </w:sdt>
       </w:sdtContent>
     </w:sdt>
-    <w:p/>
-    <w:p>
-      <w:r>
-        <w:t>Appendix</w:t>
-      </w:r>
-    </w:p>
-    <w:p>
-      <w:r>
-        <w:t>Mention: "Raw simulation data is provided in report/simulation_data.csv and source code is attached."</w:t>
-      </w:r>
-    </w:p>
     <w:sectPr>
       <w:pgSz w:w="11906" w:h="16838"/>
       <w:pgMar w:top="1440" w:right="1440" w:bottom="1440" w:left="1440" w:header="708" w:footer="708" w:gutter="0"/>

</xml_diff>